<commit_message>
Development to teaching (#80)
* Rx java commit

* Paypal interview 2025 commit

* HCL intervew commit

* HCL intervew commit

* leet code algo bit operator

# Conflicts:
#	algorithms/src/test/java/com/leetcode/algorithms/bit/manipulation/easy/IBitEasyOperationTest.java

* thread

* hcl interview

* core-system-design module

* core-system-design module removed

* core-system-design module removed

* core-system-design module removed

* leet-code module and graph

* leet-code module and graph

* leet-code module and graph

* leet-code module and graph

* leet-code module and graph

* leet-code code move from algorithm to leet-code

* leet-code code move from algorithm to leet-code

* leet-code code move from algorithm to leet-code

* Changing java24 to java25

* IWipro

* leet code

* ms, spring and boot, deep question-ans

* ms, spring and boot, deep question-ans

* deep question

* deep question

* deep question

* LRU
</commit_message>
<xml_diff>
--- a/interview-corner/src/common/prepdoc/new/kafka.docx
+++ b/interview-corner/src/common/prepdoc/new/kafka.docx
@@ -284,18 +284,8 @@
           <w:color w:val="373E3F"/>
           <w:spacing w:val="2"/>
         </w:rPr>
-        <w:t xml:space="preserve">Following are the key features of </w:t>
-      </w:r>
-      <w:proofErr w:type="gramStart"/>
-      <w:r>
-        <w:rPr>
-          <w:rFonts w:ascii="Lato" w:hAnsi="Lato"/>
-          <w:color w:val="373E3F"/>
-          <w:spacing w:val="2"/>
-        </w:rPr>
-        <w:t>Kafka:-</w:t>
-      </w:r>
-      <w:proofErr w:type="gramEnd"/>
+        <w:t>Following are the key features of Kafka:-</w:t>
+      </w:r>
     </w:p>
     <w:p>
       <w:pPr>
@@ -570,18 +560,8 @@
           <w:color w:val="373E3F"/>
           <w:spacing w:val="2"/>
         </w:rPr>
-        <w:t xml:space="preserve">Following are the traditional methods of message </w:t>
-      </w:r>
-      <w:proofErr w:type="gramStart"/>
-      <w:r>
-        <w:rPr>
-          <w:rFonts w:ascii="Lato" w:hAnsi="Lato"/>
-          <w:color w:val="373E3F"/>
-          <w:spacing w:val="2"/>
-        </w:rPr>
-        <w:t>transfer:-</w:t>
-      </w:r>
-      <w:proofErr w:type="gramEnd"/>
+        <w:t>Following are the traditional methods of message transfer:-</w:t>
+      </w:r>
     </w:p>
     <w:p>
       <w:pPr>
@@ -605,27 +585,7 @@
           <w:spacing w:val="2"/>
         </w:rPr>
         <w:lastRenderedPageBreak/>
-        <w:t xml:space="preserve">Message </w:t>
-      </w:r>
-      <w:proofErr w:type="gramStart"/>
-      <w:r>
-        <w:rPr>
-          <w:rStyle w:val="Strong"/>
-          <w:rFonts w:ascii="Lato" w:hAnsi="Lato"/>
-          <w:color w:val="515151"/>
-          <w:spacing w:val="2"/>
-        </w:rPr>
-        <w:t>Queuing:-</w:t>
-      </w:r>
-      <w:proofErr w:type="gramEnd"/>
-      <w:r>
-        <w:rPr>
-          <w:rStyle w:val="Strong"/>
-          <w:rFonts w:ascii="Lato" w:hAnsi="Lato"/>
-          <w:color w:val="515151"/>
-          <w:spacing w:val="2"/>
-        </w:rPr>
-        <w:t> </w:t>
+        <w:t>Message Queuing:- </w:t>
       </w:r>
       <w:r>
         <w:rPr>
@@ -734,27 +694,7 @@
           <w:color w:val="515151"/>
           <w:spacing w:val="2"/>
         </w:rPr>
-        <w:t xml:space="preserve">Publisher - Subscriber </w:t>
-      </w:r>
-      <w:proofErr w:type="gramStart"/>
-      <w:r>
-        <w:rPr>
-          <w:rStyle w:val="Strong"/>
-          <w:rFonts w:ascii="Lato" w:hAnsi="Lato"/>
-          <w:color w:val="515151"/>
-          <w:spacing w:val="2"/>
-        </w:rPr>
-        <w:t>Model:-</w:t>
-      </w:r>
-      <w:proofErr w:type="gramEnd"/>
-      <w:r>
-        <w:rPr>
-          <w:rStyle w:val="Strong"/>
-          <w:rFonts w:ascii="Lato" w:hAnsi="Lato"/>
-          <w:color w:val="515151"/>
-          <w:spacing w:val="2"/>
-        </w:rPr>
-        <w:t> </w:t>
+        <w:t>Publisher - Subscriber Model:- </w:t>
       </w:r>
       <w:r>
         <w:rPr>
@@ -1000,18 +940,8 @@
           <w:color w:val="373E3F"/>
           <w:spacing w:val="2"/>
         </w:rPr>
-        <w:t xml:space="preserve">Following are the major components of </w:t>
-      </w:r>
-      <w:proofErr w:type="gramStart"/>
-      <w:r>
-        <w:rPr>
-          <w:rFonts w:ascii="Lato" w:hAnsi="Lato"/>
-          <w:color w:val="373E3F"/>
-          <w:spacing w:val="2"/>
-        </w:rPr>
-        <w:t>Kafka:-</w:t>
-      </w:r>
-      <w:proofErr w:type="gramEnd"/>
+        <w:t>Following are the major components of Kafka:-</w:t>
+      </w:r>
     </w:p>
     <w:p>
       <w:pPr>
@@ -1349,27 +1279,7 @@
           <w:spacing w:val="2"/>
           <w:highlight w:val="green"/>
         </w:rPr>
-        <w:t xml:space="preserve">The cluster is managed and coordinated by brokers using Apache </w:t>
-      </w:r>
-      <w:proofErr w:type="spellStart"/>
-      <w:r>
-        <w:rPr>
-          <w:rFonts w:ascii="Lato" w:hAnsi="Lato"/>
-          <w:color w:val="515151"/>
-          <w:spacing w:val="2"/>
-          <w:highlight w:val="green"/>
-        </w:rPr>
-        <w:t>ZooKeeper</w:t>
-      </w:r>
-      <w:proofErr w:type="spellEnd"/>
-      <w:r>
-        <w:rPr>
-          <w:rFonts w:ascii="Lato" w:hAnsi="Lato"/>
-          <w:color w:val="515151"/>
-          <w:spacing w:val="2"/>
-          <w:highlight w:val="green"/>
-        </w:rPr>
-        <w:t>.</w:t>
+        <w:t>The cluster is managed and coordinated by brokers using Apache ZooKeeper.</w:t>
       </w:r>
       <w:r>
         <w:rPr>
@@ -1394,23 +1304,13 @@
           <w:spacing w:val="2"/>
         </w:rPr>
       </w:pPr>
-      <w:proofErr w:type="spellStart"/>
       <w:r>
         <w:rPr>
           <w:rFonts w:ascii="Lato" w:hAnsi="Lato"/>
           <w:color w:val="FF0000"/>
           <w:spacing w:val="2"/>
         </w:rPr>
-        <w:t>ZooKeeper</w:t>
-      </w:r>
-      <w:proofErr w:type="spellEnd"/>
-      <w:r>
-        <w:rPr>
-          <w:rFonts w:ascii="Lato" w:hAnsi="Lato"/>
-          <w:color w:val="FF0000"/>
-          <w:spacing w:val="2"/>
-        </w:rPr>
-        <w:t xml:space="preserve"> is also used by Kafka brokers for leader elections, in which a broker is chosen to lead the handling of client requests for a certain partition of a topic. Connecting to any broker will bring a client up to speed with the entire Kafka cluster.</w:t>
+        <w:t>ZooKeeper is also used by Kafka brokers for leader elections, in which a broker is chosen to lead the handling of client requests for a certain partition of a topic. Connecting to any broker will bring a client up to speed with the entire Kafka cluster.</w:t>
       </w:r>
       <w:r>
         <w:rPr>
@@ -1930,146 +1830,43 @@
           <w:spacing w:val="2"/>
           <w:highlight w:val="yellow"/>
         </w:rPr>
-        <w:t xml:space="preserve">Apache </w:t>
-      </w:r>
-      <w:proofErr w:type="spellStart"/>
+        <w:t>Apache ZooKeeper is a naming registry for distributed applications as well as a distributed, open-source configuration and synchronization service. It keeps track of the Kafka cluster nodes' status, as well as Kafka topics, partitions, and so on</w:t>
+      </w:r>
       <w:r>
         <w:rPr>
           <w:rFonts w:ascii="Lato" w:hAnsi="Lato"/>
           <w:color w:val="373E3F"/>
           <w:spacing w:val="2"/>
+        </w:rPr>
+        <w:t>.</w:t>
+      </w:r>
+    </w:p>
+    <w:p>
+      <w:pPr>
+        <w:pStyle w:val="NormalWeb"/>
+        <w:shd w:val="clear" w:color="auto" w:fill="FFFFFF"/>
+        <w:rPr>
+          <w:rFonts w:ascii="Lato" w:hAnsi="Lato"/>
+          <w:color w:val="373E3F"/>
+          <w:spacing w:val="2"/>
+        </w:rPr>
+      </w:pPr>
+      <w:r>
+        <w:rPr>
+          <w:rFonts w:ascii="Lato" w:hAnsi="Lato"/>
+          <w:color w:val="373E3F"/>
+          <w:spacing w:val="2"/>
           <w:highlight w:val="yellow"/>
         </w:rPr>
-        <w:t>ZooKeeper</w:t>
-      </w:r>
-      <w:proofErr w:type="spellEnd"/>
+        <w:t>ZooKeeper is used by Kafka brokers to maintain and coordinate the Kafka cluster</w:t>
+      </w:r>
       <w:r>
         <w:rPr>
           <w:rFonts w:ascii="Lato" w:hAnsi="Lato"/>
           <w:color w:val="373E3F"/>
           <w:spacing w:val="2"/>
-          <w:highlight w:val="yellow"/>
-        </w:rPr>
-        <w:t xml:space="preserve"> is a naming registry for distributed applications as well as a distributed, open-source configuration and synchronization service. It keeps track of the Kafka cluster nodes' status, as well as Kafka topics, partitions, and so on</w:t>
-      </w:r>
-      <w:r>
-        <w:rPr>
-          <w:rFonts w:ascii="Lato" w:hAnsi="Lato"/>
-          <w:color w:val="373E3F"/>
-          <w:spacing w:val="2"/>
-        </w:rPr>
-        <w:t>.</w:t>
-      </w:r>
-    </w:p>
-    <w:p>
-      <w:pPr>
-        <w:pStyle w:val="NormalWeb"/>
-        <w:shd w:val="clear" w:color="auto" w:fill="FFFFFF"/>
-        <w:rPr>
-          <w:rFonts w:ascii="Lato" w:hAnsi="Lato"/>
-          <w:color w:val="373E3F"/>
-          <w:spacing w:val="2"/>
-        </w:rPr>
-      </w:pPr>
-      <w:proofErr w:type="spellStart"/>
-      <w:r>
-        <w:rPr>
-          <w:rFonts w:ascii="Lato" w:hAnsi="Lato"/>
-          <w:color w:val="373E3F"/>
-          <w:spacing w:val="2"/>
-          <w:highlight w:val="yellow"/>
-        </w:rPr>
-        <w:t>ZooKeeper</w:t>
-      </w:r>
-      <w:proofErr w:type="spellEnd"/>
-      <w:r>
-        <w:rPr>
-          <w:rFonts w:ascii="Lato" w:hAnsi="Lato"/>
-          <w:color w:val="373E3F"/>
-          <w:spacing w:val="2"/>
-          <w:highlight w:val="yellow"/>
-        </w:rPr>
-        <w:t xml:space="preserve"> is used by Kafka brokers to maintain and coordinate the Kafka cluster</w:t>
-      </w:r>
-      <w:r>
-        <w:rPr>
-          <w:rFonts w:ascii="Lato" w:hAnsi="Lato"/>
-          <w:color w:val="373E3F"/>
-          <w:spacing w:val="2"/>
-        </w:rPr>
-        <w:t xml:space="preserve">. When the topology of the Kafka cluster changes, such as when brokers and topics are added or removed, </w:t>
-      </w:r>
-      <w:proofErr w:type="spellStart"/>
-      <w:r>
-        <w:rPr>
-          <w:rFonts w:ascii="Lato" w:hAnsi="Lato"/>
-          <w:color w:val="373E3F"/>
-          <w:spacing w:val="2"/>
-        </w:rPr>
-        <w:t>ZooKeeper</w:t>
-      </w:r>
-      <w:proofErr w:type="spellEnd"/>
-      <w:r>
-        <w:rPr>
-          <w:rFonts w:ascii="Lato" w:hAnsi="Lato"/>
-          <w:color w:val="373E3F"/>
-          <w:spacing w:val="2"/>
-        </w:rPr>
-        <w:t xml:space="preserve"> notifies all nodes. When a new broker enters the cluster, for example, </w:t>
-      </w:r>
-      <w:proofErr w:type="spellStart"/>
-      <w:r>
-        <w:rPr>
-          <w:rFonts w:ascii="Lato" w:hAnsi="Lato"/>
-          <w:color w:val="373E3F"/>
-          <w:spacing w:val="2"/>
-        </w:rPr>
-        <w:t>ZooKeeper</w:t>
-      </w:r>
-      <w:proofErr w:type="spellEnd"/>
-      <w:r>
-        <w:rPr>
-          <w:rFonts w:ascii="Lato" w:hAnsi="Lato"/>
-          <w:color w:val="373E3F"/>
-          <w:spacing w:val="2"/>
-        </w:rPr>
-        <w:t xml:space="preserve"> notifies the cluster, as well as when a broker fails. </w:t>
-      </w:r>
-      <w:proofErr w:type="spellStart"/>
-      <w:r>
-        <w:rPr>
-          <w:rFonts w:ascii="Lato" w:hAnsi="Lato"/>
-          <w:color w:val="373E3F"/>
-          <w:spacing w:val="2"/>
-        </w:rPr>
-        <w:t>ZooKeeper</w:t>
-      </w:r>
-      <w:proofErr w:type="spellEnd"/>
-      <w:r>
-        <w:rPr>
-          <w:rFonts w:ascii="Lato" w:hAnsi="Lato"/>
-          <w:color w:val="373E3F"/>
-          <w:spacing w:val="2"/>
-        </w:rPr>
-        <w:t xml:space="preserve"> also allows brokers and topic partition pairs to elect leaders, allowing them to select which broker will be the leader for a given partition (and server read and write operations from producers and consumers), as well as which brokers contain clones of the same data. When the cluster of brokers receives a notification from </w:t>
-      </w:r>
-      <w:proofErr w:type="spellStart"/>
-      <w:r>
-        <w:rPr>
-          <w:rFonts w:ascii="Lato" w:hAnsi="Lato"/>
-          <w:color w:val="373E3F"/>
-          <w:spacing w:val="2"/>
-        </w:rPr>
-        <w:t>ZooKeeper</w:t>
-      </w:r>
-      <w:proofErr w:type="spellEnd"/>
-      <w:r>
-        <w:rPr>
-          <w:rFonts w:ascii="Lato" w:hAnsi="Lato"/>
-          <w:color w:val="373E3F"/>
-          <w:spacing w:val="2"/>
-        </w:rPr>
-        <w:t>, they immediately begin to coordinate with one another and elect any new partition leaders that are required. This safeguards against the unexpected absence of a broker.</w:t>
+        </w:rPr>
+        <w:t>. When the topology of the Kafka cluster changes, such as when brokers and topics are added or removed, ZooKeeper notifies all nodes. When a new broker enters the cluster, for example, ZooKeeper notifies the cluster, as well as when a broker fails. ZooKeeper also allows brokers and topic partition pairs to elect leaders, allowing them to select which broker will be the leader for a given partition (and server read and write operations from producers and consumers), as well as which brokers contain clones of the same data. When the cluster of brokers receives a notification from ZooKeeper, they immediately begin to coordinate with one another and elect any new partition leaders that are required. This safeguards against the unexpected absence of a broker.</w:t>
       </w:r>
     </w:p>
     <w:p>
@@ -2178,43 +1975,7 @@
           <w:color w:val="515151"/>
           <w:spacing w:val="2"/>
         </w:rPr>
-        <w:t xml:space="preserve">Kafka can now be used without </w:t>
-      </w:r>
-      <w:proofErr w:type="spellStart"/>
-      <w:r>
-        <w:rPr>
-          <w:rFonts w:ascii="Lato" w:hAnsi="Lato"/>
-          <w:color w:val="515151"/>
-          <w:spacing w:val="2"/>
-        </w:rPr>
-        <w:t>ZooKeeper</w:t>
-      </w:r>
-      <w:proofErr w:type="spellEnd"/>
-      <w:r>
-        <w:rPr>
-          <w:rFonts w:ascii="Lato" w:hAnsi="Lato"/>
-          <w:color w:val="515151"/>
-          <w:spacing w:val="2"/>
-        </w:rPr>
-        <w:t xml:space="preserve"> as of version 2.8. The release of Kafka 2.8.0 in April 2021 gave us all the opportunity to try it out without </w:t>
-      </w:r>
-      <w:proofErr w:type="spellStart"/>
-      <w:r>
-        <w:rPr>
-          <w:rFonts w:ascii="Lato" w:hAnsi="Lato"/>
-          <w:color w:val="515151"/>
-          <w:spacing w:val="2"/>
-        </w:rPr>
-        <w:t>ZooKeeper</w:t>
-      </w:r>
-      <w:proofErr w:type="spellEnd"/>
-      <w:r>
-        <w:rPr>
-          <w:rFonts w:ascii="Lato" w:hAnsi="Lato"/>
-          <w:color w:val="515151"/>
-          <w:spacing w:val="2"/>
-        </w:rPr>
-        <w:t>. However, this version is not yet ready for production and lacks some key features.</w:t>
+        <w:t>Kafka can now be used without ZooKeeper as of version 2.8. The release of Kafka 2.8.0 in April 2021 gave us all the opportunity to try it out without ZooKeeper. However, this version is not yet ready for production and lacks some key features.</w:t>
       </w:r>
     </w:p>
     <w:p>
@@ -2276,7 +2037,25 @@
           <w:spacing w:val="2"/>
           <w:highlight w:val="yellow"/>
         </w:rPr>
-        <w:t>In Kafka, each partition has one server that acts as a Leader and one or more servers that operate as Followers. The Leader is in charge of all read and writes requests for the partition, while the Followers are responsible for passively replicating the leader. In the case that the Leader fails, one of the Followers will assume leadership. The server's load is balanced as a result of this.</w:t>
+        <w:t xml:space="preserve">In Kafka, each partition has one server that acts as a Leader and one or more servers that operate as Followers. </w:t>
+      </w:r>
+      <w:r>
+        <w:rPr>
+          <w:rFonts w:ascii="Lato" w:hAnsi="Lato"/>
+          <w:color w:val="EE0000"/>
+          <w:spacing w:val="2"/>
+          <w:highlight w:val="yellow"/>
+        </w:rPr>
+        <w:t>The Leader is in charge of all read and writes requests for the partition, while the Followers are responsible for passively replicating the leader</w:t>
+      </w:r>
+      <w:r>
+        <w:rPr>
+          <w:rFonts w:ascii="Lato" w:hAnsi="Lato"/>
+          <w:color w:val="373E3F"/>
+          <w:spacing w:val="2"/>
+          <w:highlight w:val="yellow"/>
+        </w:rPr>
+        <w:t>. In the case that the Leader fails, one of the Followers will assume leadership. The server's load is balanced as a result of this.</w:t>
       </w:r>
     </w:p>
     <w:p>
@@ -2690,6 +2469,7 @@
           <w:rFonts w:ascii="Lato" w:hAnsi="Lato"/>
           <w:color w:val="373E3F"/>
           <w:spacing w:val="2"/>
+          <w:highlight w:val="yellow"/>
         </w:rPr>
         <w:t>A replica that has been out of ISR for a long period of time indicates that the follower is unable to fetch data at the same rate as the leader.</w:t>
       </w:r>
@@ -2728,8 +2508,17 @@
           <w:rFonts w:ascii="Lato" w:hAnsi="Lato"/>
           <w:color w:val="373E3F"/>
           <w:spacing w:val="2"/>
-        </w:rPr>
-        <w:t>Firstly, we extract Kafka once we have downloaded the most recent version. We must make sure that our local environment has Java 8+ installed in order to run Kafka.</w:t>
+          <w:highlight w:val="yellow"/>
+        </w:rPr>
+        <w:t>Firstly, we extract Kafka once we have downloaded the most recent version. We must make sure that our local environment has Java 8+ installed in order to run Kafka</w:t>
+      </w:r>
+      <w:r>
+        <w:rPr>
+          <w:rFonts w:ascii="Lato" w:hAnsi="Lato"/>
+          <w:color w:val="373E3F"/>
+          <w:spacing w:val="2"/>
+        </w:rPr>
+        <w:t>.</w:t>
       </w:r>
     </w:p>
     <w:p>
@@ -2771,25 +2560,7 @@
           <w:color w:val="515151"/>
           <w:spacing w:val="2"/>
         </w:rPr>
-        <w:t xml:space="preserve">Start the </w:t>
-      </w:r>
-      <w:proofErr w:type="spellStart"/>
-      <w:r>
-        <w:rPr>
-          <w:rFonts w:ascii="Lato" w:hAnsi="Lato"/>
-          <w:color w:val="515151"/>
-          <w:spacing w:val="2"/>
-        </w:rPr>
-        <w:t>ZooKeeper</w:t>
-      </w:r>
-      <w:proofErr w:type="spellEnd"/>
-      <w:r>
-        <w:rPr>
-          <w:rFonts w:ascii="Lato" w:hAnsi="Lato"/>
-          <w:color w:val="515151"/>
-          <w:spacing w:val="2"/>
-        </w:rPr>
-        <w:t xml:space="preserve"> service by doing the following:</w:t>
+        <w:t>Start the ZooKeeper service by doing the following:</w:t>
       </w:r>
     </w:p>
     <w:p>
@@ -2810,20 +2581,8 @@
           <w:spacing w:val="2"/>
           <w:shd w:val="clear" w:color="auto" w:fill="F5F8FF"/>
         </w:rPr>
-        <w:t>$bin/zookeeper-server-start.sh config/</w:t>
-      </w:r>
-      <w:proofErr w:type="spellStart"/>
-      <w:r>
-        <w:rPr>
-          <w:rStyle w:val="HTMLCode"/>
-          <w:rFonts w:ascii="Lato" w:hAnsi="Lato"/>
-          <w:color w:val="444444"/>
-          <w:spacing w:val="2"/>
-          <w:shd w:val="clear" w:color="auto" w:fill="F5F8FF"/>
-        </w:rPr>
-        <w:t>zookeeper.properties</w:t>
-      </w:r>
-      <w:proofErr w:type="spellEnd"/>
+        <w:t>$bin/zookeeper-server-start.sh config/zookeeper.properties</w:t>
+      </w:r>
     </w:p>
     <w:p>
       <w:pPr>
@@ -2866,20 +2625,8 @@
           <w:spacing w:val="2"/>
           <w:shd w:val="clear" w:color="auto" w:fill="F5F8FF"/>
         </w:rPr>
-        <w:t>$ bin/kafka-server-start.sh config/</w:t>
-      </w:r>
-      <w:proofErr w:type="spellStart"/>
-      <w:r>
-        <w:rPr>
-          <w:rStyle w:val="HTMLCode"/>
-          <w:rFonts w:ascii="Lato" w:hAnsi="Lato"/>
-          <w:color w:val="444444"/>
-          <w:spacing w:val="2"/>
-          <w:shd w:val="clear" w:color="auto" w:fill="F5F8FF"/>
-        </w:rPr>
-        <w:t>server.properties</w:t>
-      </w:r>
-      <w:proofErr w:type="spellEnd"/>
+        <w:t>$ bin/kafka-server-start.sh config/server.properties</w:t>
+      </w:r>
     </w:p>
     <w:p>
       <w:pPr>
@@ -2925,74 +2672,46 @@
           <w:color w:val="373E3F"/>
           <w:spacing w:val="2"/>
         </w:rPr>
-        <w:t xml:space="preserve"> Geo-replication can be accomplished with Kafka's </w:t>
-      </w:r>
-      <w:proofErr w:type="spellStart"/>
-      <w:r>
+        <w:t xml:space="preserve"> Geo-replication can be accomplished with Kafka's MirrorMaker Tool. Geo-replication is a technique for ensuring data backup.</w:t>
+      </w:r>
+    </w:p>
+    <w:p>
+      <w:pPr>
+        <w:pStyle w:val="Heading3"/>
+        <w:shd w:val="clear" w:color="auto" w:fill="FFFFFF"/>
+        <w:rPr>
+          <w:rFonts w:ascii="Lato" w:hAnsi="Lato"/>
+          <w:color w:val="FF0000"/>
+          <w:spacing w:val="2"/>
+        </w:rPr>
+      </w:pPr>
+      <w:r>
+        <w:rPr>
+          <w:rFonts w:ascii="Lato" w:hAnsi="Lato"/>
+          <w:color w:val="FF0000"/>
+          <w:spacing w:val="2"/>
+        </w:rPr>
+        <w:t>15. What are some of the disadvantages of Kafka?</w:t>
+      </w:r>
+    </w:p>
+    <w:p>
+      <w:pPr>
+        <w:pStyle w:val="NormalWeb"/>
+        <w:shd w:val="clear" w:color="auto" w:fill="FFFFFF"/>
         <w:rPr>
           <w:rFonts w:ascii="Lato" w:hAnsi="Lato"/>
           <w:color w:val="373E3F"/>
           <w:spacing w:val="2"/>
         </w:rPr>
-        <w:t>MirrorMaker</w:t>
-      </w:r>
-      <w:proofErr w:type="spellEnd"/>
+      </w:pPr>
       <w:r>
         <w:rPr>
           <w:rFonts w:ascii="Lato" w:hAnsi="Lato"/>
           <w:color w:val="373E3F"/>
           <w:spacing w:val="2"/>
         </w:rPr>
-        <w:t xml:space="preserve"> Tool. Geo-replication is a technique for ensuring data backup.</w:t>
-      </w:r>
-    </w:p>
-    <w:p>
-      <w:pPr>
-        <w:pStyle w:val="Heading3"/>
-        <w:shd w:val="clear" w:color="auto" w:fill="FFFFFF"/>
-        <w:rPr>
-          <w:rFonts w:ascii="Lato" w:hAnsi="Lato"/>
-          <w:color w:val="FF0000"/>
-          <w:spacing w:val="2"/>
-        </w:rPr>
-      </w:pPr>
-      <w:r>
-        <w:rPr>
-          <w:rFonts w:ascii="Lato" w:hAnsi="Lato"/>
-          <w:color w:val="FF0000"/>
-          <w:spacing w:val="2"/>
-        </w:rPr>
-        <w:t>15. What are some of the disadvantages of Kafka?</w:t>
-      </w:r>
-    </w:p>
-    <w:p>
-      <w:pPr>
-        <w:pStyle w:val="NormalWeb"/>
-        <w:shd w:val="clear" w:color="auto" w:fill="FFFFFF"/>
-        <w:rPr>
-          <w:rFonts w:ascii="Lato" w:hAnsi="Lato"/>
-          <w:color w:val="373E3F"/>
-          <w:spacing w:val="2"/>
-        </w:rPr>
-      </w:pPr>
-      <w:r>
-        <w:rPr>
-          <w:rFonts w:ascii="Lato" w:hAnsi="Lato"/>
-          <w:color w:val="373E3F"/>
-          <w:spacing w:val="2"/>
-        </w:rPr>
-        <w:t xml:space="preserve">Following are the disadvantages of </w:t>
-      </w:r>
-      <w:proofErr w:type="gramStart"/>
-      <w:r>
-        <w:rPr>
-          <w:rFonts w:ascii="Lato" w:hAnsi="Lato"/>
-          <w:color w:val="373E3F"/>
-          <w:spacing w:val="2"/>
-        </w:rPr>
-        <w:t>Kafka :</w:t>
-      </w:r>
-      <w:proofErr w:type="gramEnd"/>
+        <w:t>Following are the disadvantages of Kafka :</w:t>
+      </w:r>
     </w:p>
     <w:p>
       <w:pPr>
@@ -3027,14 +2746,14 @@
         <w:spacing w:before="100" w:beforeAutospacing="1" w:after="100" w:afterAutospacing="1" w:line="240" w:lineRule="auto"/>
         <w:rPr>
           <w:rFonts w:ascii="Lato" w:hAnsi="Lato"/>
-          <w:color w:val="515151"/>
-          <w:spacing w:val="2"/>
-        </w:rPr>
-      </w:pPr>
-      <w:r>
-        <w:rPr>
-          <w:rFonts w:ascii="Lato" w:hAnsi="Lato"/>
-          <w:color w:val="515151"/>
+          <w:color w:val="EE0000"/>
+          <w:spacing w:val="2"/>
+        </w:rPr>
+      </w:pPr>
+      <w:r>
+        <w:rPr>
+          <w:rFonts w:ascii="Lato" w:hAnsi="Lato"/>
+          <w:color w:val="EE0000"/>
           <w:spacing w:val="2"/>
         </w:rPr>
         <w:t>Wildcard topic selection is not supported by Kafka. It is necessary to match the exact topic name.</w:t>
@@ -3057,11 +2776,19 @@
       <w:r>
         <w:rPr>
           <w:rFonts w:ascii="Lato" w:hAnsi="Lato"/>
-          <w:color w:val="515151"/>
+          <w:color w:val="EE0000"/>
           <w:spacing w:val="2"/>
         </w:rPr>
         <w:lastRenderedPageBreak/>
-        <w:t>Brokers and consumers reduce Kafka's performance when dealing with huge messages by compressing and decompressing the messages. This has an impact on Kafka's throughput and performance.</w:t>
+        <w:t>Brokers and consumers reduce Kafka's performance when dealing with huge messages by compressing and decompressing the messages</w:t>
+      </w:r>
+      <w:r>
+        <w:rPr>
+          <w:rFonts w:ascii="Lato" w:hAnsi="Lato"/>
+          <w:color w:val="515151"/>
+          <w:spacing w:val="2"/>
+        </w:rPr>
+        <w:t>. This has an impact on Kafka's throughput and performance.</w:t>
       </w:r>
     </w:p>
     <w:p>
@@ -3081,10 +2808,18 @@
       <w:r>
         <w:rPr>
           <w:rFonts w:ascii="Lato" w:hAnsi="Lato"/>
-          <w:color w:val="515151"/>
-          <w:spacing w:val="2"/>
-        </w:rPr>
-        <w:t>Certain message paradigms, including point-to-point queues and request/reply, are not supported by Kafka.</w:t>
+          <w:color w:val="EE0000"/>
+          <w:spacing w:val="2"/>
+        </w:rPr>
+        <w:t>Certain message paradigms, including point-to-point queues and request/reply, are not supported by Kafka</w:t>
+      </w:r>
+      <w:r>
+        <w:rPr>
+          <w:rFonts w:ascii="Lato" w:hAnsi="Lato"/>
+          <w:color w:val="515151"/>
+          <w:spacing w:val="2"/>
+        </w:rPr>
+        <w:t>.</w:t>
       </w:r>
     </w:p>
     <w:p>
@@ -3537,14 +3272,14 @@
         <w:shd w:val="clear" w:color="auto" w:fill="FFFFFF"/>
         <w:rPr>
           <w:rFonts w:ascii="Lato" w:hAnsi="Lato"/>
-          <w:color w:val="515151"/>
-          <w:spacing w:val="2"/>
-        </w:rPr>
-      </w:pPr>
-      <w:r>
-        <w:rPr>
-          <w:rFonts w:ascii="Lato" w:hAnsi="Lato"/>
-          <w:color w:val="515151"/>
+          <w:color w:val="EE0000"/>
+          <w:spacing w:val="2"/>
+        </w:rPr>
+      </w:pPr>
+      <w:r>
+        <w:rPr>
+          <w:rFonts w:ascii="Lato" w:hAnsi="Lato"/>
+          <w:color w:val="EE0000"/>
           <w:spacing w:val="2"/>
         </w:rPr>
         <w:t>18. What do you mean by Kafka schema registry?</w:t>
@@ -3759,7 +3494,32 @@
           <w:color w:val="373E3F"/>
           <w:spacing w:val="2"/>
         </w:rPr>
-        <w:t>In Kafka terminology, messages are referred to as records. Each record has a key and a value, with the key being optional. For record partitioning, the record's key is used. There will be one or more partitions for each topic. Partitioning is a straightforward data structure. It's the append-only sequence of records, which is arranged chronologically by the time they were attached. Once a record is written to a partition, it is given an offset – a sequential id that reflects the record's position in the partition and uniquely identifies it inside it.</w:t>
+        <w:t xml:space="preserve">In Kafka terminology, messages are referred to as records. Each record has a key and a value, with the key being optional. For record partitioning, the record's key is used. There will be one or more partitions for each topic. </w:t>
+      </w:r>
+      <w:r>
+        <w:rPr>
+          <w:rFonts w:ascii="Lato" w:hAnsi="Lato"/>
+          <w:color w:val="EE0000"/>
+          <w:spacing w:val="2"/>
+        </w:rPr>
+        <w:t>Partitioning is a straightforward data structure. It's the append-only sequence of records, which is arranged chronologically by the time they were attached</w:t>
+      </w:r>
+      <w:r>
+        <w:rPr>
+          <w:rFonts w:ascii="Lato" w:hAnsi="Lato"/>
+          <w:color w:val="373E3F"/>
+          <w:spacing w:val="2"/>
+        </w:rPr>
+        <w:t xml:space="preserve">. </w:t>
+      </w:r>
+      <w:r>
+        <w:rPr>
+          <w:rFonts w:ascii="Lato" w:hAnsi="Lato"/>
+          <w:color w:val="373E3F"/>
+          <w:spacing w:val="2"/>
+          <w:highlight w:val="yellow"/>
+        </w:rPr>
+        <w:t>Once a record is written to a partition, it is given an offset – a sequential id that reflects the record's position in the partition and uniquely identifies it inside it.</w:t>
       </w:r>
     </w:p>
     <w:p>
@@ -3864,25 +3624,7 @@
           <w:spacing w:val="2"/>
         </w:rPr>
         <w:lastRenderedPageBreak/>
-        <w:t xml:space="preserve">This is important because we may have to deliver records to customers in the same order that they were made. You want these events to come in the order they were created when a consumer purchases an eBook from your </w:t>
-      </w:r>
-      <w:proofErr w:type="spellStart"/>
-      <w:r>
-        <w:rPr>
-          <w:rFonts w:ascii="Lato" w:hAnsi="Lato"/>
-          <w:color w:val="373E3F"/>
-          <w:spacing w:val="2"/>
-        </w:rPr>
-        <w:t>webshop</w:t>
-      </w:r>
-      <w:proofErr w:type="spellEnd"/>
-      <w:r>
-        <w:rPr>
-          <w:rFonts w:ascii="Lato" w:hAnsi="Lato"/>
-          <w:color w:val="373E3F"/>
-          <w:spacing w:val="2"/>
-        </w:rPr>
-        <w:t xml:space="preserve"> and subsequently cancels the transaction. If you receive a cancellation event before a buy event, the cancellation will be rejected as invalid (since the purchase has not yet been registered in the system), and the system will then record the purchase and send the product to the client (and lose you money). You might use a customer id as the key of these Kafka records to solve this problem and assure ordering. This will ensure that all of a customer's purchase events are grouped together in the same partition.</w:t>
+        <w:t>This is important because we may have to deliver records to customers in the same order that they were made. You want these events to come in the order they were created when a consumer purchases an eBook from your webshop and subsequently cancels the transaction. If you receive a cancellation event before a buy event, the cancellation will be rejected as invalid (since the purchase has not yet been registered in the system), and the system will then record the purchase and send the product to the client (and lose you money). You might use a customer id as the key of these Kafka records to solve this problem and assure ordering. This will ensure that all of a customer's purchase events are grouped together in the same partition.</w:t>
       </w:r>
     </w:p>
     <w:p>
@@ -4137,10 +3879,19 @@
         <w:rPr>
           <w:rStyle w:val="Strong"/>
           <w:rFonts w:ascii="Lato" w:hAnsi="Lato"/>
-          <w:color w:val="515151"/>
-          <w:spacing w:val="2"/>
-        </w:rPr>
-        <w:t>Preferred Replica Leader Election Tool:</w:t>
+          <w:color w:val="EE0000"/>
+          <w:spacing w:val="2"/>
+        </w:rPr>
+        <w:t>Preferred Replica Leader Election Tool</w:t>
+      </w:r>
+      <w:r>
+        <w:rPr>
+          <w:rStyle w:val="Strong"/>
+          <w:rFonts w:ascii="Lato" w:hAnsi="Lato"/>
+          <w:color w:val="515151"/>
+          <w:spacing w:val="2"/>
+        </w:rPr>
+        <w:t>:</w:t>
       </w:r>
       <w:r>
         <w:rPr>
@@ -4344,7 +4095,6 @@
           <w:spacing w:val="2"/>
         </w:rPr>
       </w:pPr>
-      <w:proofErr w:type="spellStart"/>
       <w:r>
         <w:rPr>
           <w:rStyle w:val="Strong"/>
@@ -4352,43 +4102,15 @@
           <w:color w:val="515151"/>
           <w:spacing w:val="2"/>
         </w:rPr>
-        <w:t>StateChangeLogMerger</w:t>
-      </w:r>
-      <w:proofErr w:type="spellEnd"/>
-      <w:r>
-        <w:rPr>
-          <w:rStyle w:val="Strong"/>
-          <w:rFonts w:ascii="Lato" w:hAnsi="Lato"/>
-          <w:color w:val="515151"/>
-          <w:spacing w:val="2"/>
-        </w:rPr>
-        <w:t xml:space="preserve"> tool: </w:t>
-      </w:r>
-      <w:r>
-        <w:rPr>
-          <w:rFonts w:ascii="Lato" w:hAnsi="Lato"/>
-          <w:color w:val="515151"/>
-          <w:spacing w:val="2"/>
-        </w:rPr>
-        <w:t xml:space="preserve">The </w:t>
-      </w:r>
-      <w:proofErr w:type="spellStart"/>
-      <w:r>
-        <w:rPr>
-          <w:rFonts w:ascii="Lato" w:hAnsi="Lato"/>
-          <w:color w:val="515151"/>
-          <w:spacing w:val="2"/>
-        </w:rPr>
-        <w:t>StateChangeLogMerger</w:t>
-      </w:r>
-      <w:proofErr w:type="spellEnd"/>
-      <w:r>
-        <w:rPr>
-          <w:rFonts w:ascii="Lato" w:hAnsi="Lato"/>
-          <w:color w:val="515151"/>
-          <w:spacing w:val="2"/>
-        </w:rPr>
-        <w:t xml:space="preserve"> tool collects data from brokers in a cluster, formats it into a central log, and aids in the troubleshooting of state change issues. Sometimes there are issues with the election of a leader for a particular partition. This tool can be used to figure out what's causing the issue.</w:t>
+        <w:t>StateChangeLogMerger tool: </w:t>
+      </w:r>
+      <w:r>
+        <w:rPr>
+          <w:rFonts w:ascii="Lato" w:hAnsi="Lato"/>
+          <w:color w:val="515151"/>
+          <w:spacing w:val="2"/>
+        </w:rPr>
+        <w:t>The StateChangeLogMerger tool collects data from brokers in a cluster, formats it into a central log, and aids in the troubleshooting of state change issues. Sometimes there are issues with the election of a leader for a particular partition. This tool can be used to figure out what's causing the issue.</w:t>
       </w:r>
     </w:p>
     <w:p>
@@ -4436,28 +4158,18 @@
       <w:r>
         <w:rPr>
           <w:rFonts w:ascii="Lato" w:hAnsi="Lato"/>
-          <w:color w:val="515151"/>
-          <w:spacing w:val="2"/>
-        </w:rPr>
-        <w:t xml:space="preserve">24. Differentiate between </w:t>
-      </w:r>
-      <w:proofErr w:type="spellStart"/>
-      <w:r>
-        <w:rPr>
-          <w:rFonts w:ascii="Lato" w:hAnsi="Lato"/>
-          <w:color w:val="515151"/>
-          <w:spacing w:val="2"/>
-        </w:rPr>
-        <w:t>Rabbitmq</w:t>
-      </w:r>
-      <w:proofErr w:type="spellEnd"/>
-      <w:r>
-        <w:rPr>
-          <w:rFonts w:ascii="Lato" w:hAnsi="Lato"/>
-          <w:color w:val="515151"/>
-          <w:spacing w:val="2"/>
-        </w:rPr>
-        <w:t xml:space="preserve"> and Kafka.</w:t>
+          <w:color w:val="EE0000"/>
+          <w:spacing w:val="2"/>
+        </w:rPr>
+        <w:t>24. Differentiate between Rabbitmq and Kafka</w:t>
+      </w:r>
+      <w:r>
+        <w:rPr>
+          <w:rFonts w:ascii="Lato" w:hAnsi="Lato"/>
+          <w:color w:val="515151"/>
+          <w:spacing w:val="2"/>
+        </w:rPr>
+        <w:t>.</w:t>
       </w:r>
     </w:p>
     <w:p>
@@ -4476,25 +4188,7 @@
           <w:color w:val="373E3F"/>
           <w:spacing w:val="2"/>
         </w:rPr>
-        <w:t xml:space="preserve"> Following are the differences between Kafka and </w:t>
-      </w:r>
-      <w:proofErr w:type="spellStart"/>
-      <w:r>
-        <w:rPr>
-          <w:rFonts w:ascii="Lato" w:hAnsi="Lato"/>
-          <w:color w:val="373E3F"/>
-          <w:spacing w:val="2"/>
-        </w:rPr>
-        <w:t>Rabbitmq</w:t>
-      </w:r>
-      <w:proofErr w:type="spellEnd"/>
-      <w:r>
-        <w:rPr>
-          <w:rFonts w:ascii="Lato" w:hAnsi="Lato"/>
-          <w:color w:val="373E3F"/>
-          <w:spacing w:val="2"/>
-        </w:rPr>
-        <w:t>:</w:t>
+        <w:t> Following are the differences between Kafka and Rabbitmq:</w:t>
       </w:r>
     </w:p>
     <w:p>
@@ -4581,9 +4275,19 @@
           <w:color w:val="373E3F"/>
           <w:spacing w:val="2"/>
         </w:rPr>
-        <w:t xml:space="preserve">Based on </w:t>
-      </w:r>
-      <w:proofErr w:type="gramStart"/>
+        <w:t>Based on Architecture :</w:t>
+      </w:r>
+    </w:p>
+    <w:p>
+      <w:pPr>
+        <w:pStyle w:val="NormalWeb"/>
+        <w:shd w:val="clear" w:color="auto" w:fill="FFFFFF"/>
+        <w:rPr>
+          <w:rFonts w:ascii="Lato" w:hAnsi="Lato"/>
+          <w:color w:val="373E3F"/>
+          <w:spacing w:val="2"/>
+        </w:rPr>
+      </w:pPr>
       <w:r>
         <w:rPr>
           <w:rStyle w:val="Strong"/>
@@ -4591,39 +4295,7 @@
           <w:color w:val="373E3F"/>
           <w:spacing w:val="2"/>
         </w:rPr>
-        <w:t>Architecture :</w:t>
-      </w:r>
-      <w:proofErr w:type="gramEnd"/>
-    </w:p>
-    <w:p>
-      <w:pPr>
-        <w:pStyle w:val="NormalWeb"/>
-        <w:shd w:val="clear" w:color="auto" w:fill="FFFFFF"/>
-        <w:rPr>
-          <w:rFonts w:ascii="Lato" w:hAnsi="Lato"/>
-          <w:color w:val="373E3F"/>
-          <w:spacing w:val="2"/>
-        </w:rPr>
-      </w:pPr>
-      <w:proofErr w:type="spellStart"/>
-      <w:r>
-        <w:rPr>
-          <w:rStyle w:val="Strong"/>
-          <w:rFonts w:ascii="Lato" w:hAnsi="Lato"/>
-          <w:color w:val="373E3F"/>
-          <w:spacing w:val="2"/>
-        </w:rPr>
-        <w:t>Rabbitmq</w:t>
-      </w:r>
-      <w:proofErr w:type="spellEnd"/>
-      <w:r>
-        <w:rPr>
-          <w:rStyle w:val="Strong"/>
-          <w:rFonts w:ascii="Lato" w:hAnsi="Lato"/>
-          <w:color w:val="373E3F"/>
-          <w:spacing w:val="2"/>
-        </w:rPr>
-        <w:t>: </w:t>
+        <w:t>Rabbitmq: </w:t>
       </w:r>
     </w:p>
     <w:p>
@@ -4636,27 +4308,17 @@
         <w:spacing w:before="100" w:beforeAutospacing="1" w:after="100" w:afterAutospacing="1" w:line="240" w:lineRule="auto"/>
         <w:rPr>
           <w:rFonts w:ascii="Lato" w:hAnsi="Lato"/>
-          <w:color w:val="515151"/>
-          <w:spacing w:val="2"/>
-        </w:rPr>
-      </w:pPr>
-      <w:proofErr w:type="spellStart"/>
-      <w:r>
-        <w:rPr>
-          <w:rFonts w:ascii="Lato" w:hAnsi="Lato"/>
-          <w:color w:val="515151"/>
-          <w:spacing w:val="2"/>
-        </w:rPr>
-        <w:t>Rabbitmq</w:t>
-      </w:r>
-      <w:proofErr w:type="spellEnd"/>
-      <w:r>
-        <w:rPr>
-          <w:rFonts w:ascii="Lato" w:hAnsi="Lato"/>
-          <w:color w:val="515151"/>
-          <w:spacing w:val="2"/>
-        </w:rPr>
-        <w:t xml:space="preserve"> is a general-purpose message broker and request/reply, point-to-point, and pub-sub communication patterns are all used by it.</w:t>
+          <w:color w:val="EE0000"/>
+          <w:spacing w:val="2"/>
+        </w:rPr>
+      </w:pPr>
+      <w:r>
+        <w:rPr>
+          <w:rFonts w:ascii="Lato" w:hAnsi="Lato"/>
+          <w:color w:val="EE0000"/>
+          <w:spacing w:val="2"/>
+        </w:rPr>
+        <w:t>Rabbitmq is a general-purpose message broker and request/reply, point-to-point, and pub-sub communication patterns are all used by it.</w:t>
       </w:r>
     </w:p>
     <w:p>
@@ -4671,13 +4333,15 @@
           <w:rFonts w:ascii="Lato" w:hAnsi="Lato"/>
           <w:color w:val="515151"/>
           <w:spacing w:val="2"/>
-        </w:rPr>
-      </w:pPr>
-      <w:r>
-        <w:rPr>
-          <w:rFonts w:ascii="Lato" w:hAnsi="Lato"/>
-          <w:color w:val="515151"/>
-          <w:spacing w:val="2"/>
+          <w:highlight w:val="yellow"/>
+        </w:rPr>
+      </w:pPr>
+      <w:r>
+        <w:rPr>
+          <w:rFonts w:ascii="Lato" w:hAnsi="Lato"/>
+          <w:color w:val="515151"/>
+          <w:spacing w:val="2"/>
+          <w:highlight w:val="yellow"/>
         </w:rPr>
         <w:t>It has a smart broker/ dumb consumer model. There is the consistent transmission of messages to consumers at about the same speed as the broker monitors the consumer's status.</w:t>
       </w:r>
@@ -4715,14 +4379,14 @@
         <w:spacing w:before="100" w:beforeAutospacing="1" w:after="100" w:afterAutospacing="1" w:line="240" w:lineRule="auto"/>
         <w:rPr>
           <w:rFonts w:ascii="Lato" w:hAnsi="Lato"/>
-          <w:color w:val="515151"/>
-          <w:spacing w:val="2"/>
-        </w:rPr>
-      </w:pPr>
-      <w:r>
-        <w:rPr>
-          <w:rFonts w:ascii="Lato" w:hAnsi="Lato"/>
-          <w:color w:val="515151"/>
+          <w:color w:val="EE0000"/>
+          <w:spacing w:val="2"/>
+        </w:rPr>
+      </w:pPr>
+      <w:r>
+        <w:rPr>
+          <w:rFonts w:ascii="Lato" w:hAnsi="Lato"/>
+          <w:color w:val="EE0000"/>
           <w:spacing w:val="2"/>
         </w:rPr>
         <w:t>The communication can be synchronous or asynchronous. It also provides options for distributed deployment.</w:t>
@@ -4758,14 +4422,14 @@
         <w:spacing w:before="100" w:beforeAutospacing="1" w:after="100" w:afterAutospacing="1" w:line="240" w:lineRule="auto"/>
         <w:rPr>
           <w:rFonts w:ascii="Lato" w:hAnsi="Lato"/>
-          <w:color w:val="515151"/>
-          <w:spacing w:val="2"/>
-        </w:rPr>
-      </w:pPr>
-      <w:r>
-        <w:rPr>
-          <w:rFonts w:ascii="Lato" w:hAnsi="Lato"/>
-          <w:color w:val="515151"/>
+          <w:color w:val="EE0000"/>
+          <w:spacing w:val="2"/>
+        </w:rPr>
+      </w:pPr>
+      <w:r>
+        <w:rPr>
+          <w:rFonts w:ascii="Lato" w:hAnsi="Lato"/>
+          <w:color w:val="EE0000"/>
           <w:spacing w:val="2"/>
         </w:rPr>
         <w:t>Kafka is a message and stream platform for high-volume publish-subscribe messages and streams. It is durable, quick, and scalable.</w:t>
@@ -4790,8 +4454,17 @@
           <w:rFonts w:ascii="Lato" w:hAnsi="Lato"/>
           <w:color w:val="515151"/>
           <w:spacing w:val="2"/>
-        </w:rPr>
-        <w:t>It is a durable message store, similar to a log, and it runs in a server cluster and maintains streams of records in topics (categories).</w:t>
+          <w:highlight w:val="yellow"/>
+        </w:rPr>
+        <w:t>It is a durable message store, similar to a log, and it runs in a server cluster and maintains streams of records in topics</w:t>
+      </w:r>
+      <w:r>
+        <w:rPr>
+          <w:rFonts w:ascii="Lato" w:hAnsi="Lato"/>
+          <w:color w:val="515151"/>
+          <w:spacing w:val="2"/>
+        </w:rPr>
+        <w:t xml:space="preserve"> (categories).</w:t>
       </w:r>
     </w:p>
     <w:p>
@@ -4827,17 +4500,25 @@
         <w:spacing w:before="100" w:beforeAutospacing="1" w:after="100" w:afterAutospacing="1" w:line="240" w:lineRule="auto"/>
         <w:rPr>
           <w:rFonts w:ascii="Lato" w:hAnsi="Lato"/>
-          <w:color w:val="515151"/>
-          <w:spacing w:val="2"/>
-        </w:rPr>
-      </w:pPr>
-      <w:r>
-        <w:rPr>
-          <w:rFonts w:ascii="Lato" w:hAnsi="Lato"/>
-          <w:color w:val="515151"/>
-          <w:spacing w:val="2"/>
-        </w:rPr>
-        <w:t>It has a dumb broker / smart consumer model as it does not track which messages are viewed by customers and only maintains unread messages. Kafka stores all messages for a specific amount of time.</w:t>
+          <w:color w:val="EE0000"/>
+          <w:spacing w:val="2"/>
+        </w:rPr>
+      </w:pPr>
+      <w:r>
+        <w:rPr>
+          <w:rFonts w:ascii="Lato" w:hAnsi="Lato"/>
+          <w:color w:val="515151"/>
+          <w:spacing w:val="2"/>
+        </w:rPr>
+        <w:t xml:space="preserve">It has a dumb broker / smart consumer model as it does not track which messages are viewed by customers and only maintains unread messages. </w:t>
+      </w:r>
+      <w:r>
+        <w:rPr>
+          <w:rFonts w:ascii="Lato" w:hAnsi="Lato"/>
+          <w:color w:val="EE0000"/>
+          <w:spacing w:val="2"/>
+        </w:rPr>
+        <w:t>Kafka stores all messages for a specific amount of time.</w:t>
       </w:r>
     </w:p>
     <w:p>
@@ -4880,19 +4561,8 @@
           <w:color w:val="373E3F"/>
           <w:spacing w:val="2"/>
         </w:rPr>
-        <w:t xml:space="preserve">Manner of Handling </w:t>
-      </w:r>
-      <w:proofErr w:type="gramStart"/>
-      <w:r>
-        <w:rPr>
-          <w:rStyle w:val="Strong"/>
-          <w:rFonts w:ascii="Lato" w:hAnsi="Lato"/>
-          <w:color w:val="373E3F"/>
-          <w:spacing w:val="2"/>
-        </w:rPr>
-        <w:t>Messages :</w:t>
-      </w:r>
-      <w:proofErr w:type="gramEnd"/>
+        <w:t>Manner of Handling Messages :</w:t>
+      </w:r>
     </w:p>
     <w:tbl>
       <w:tblPr>
@@ -4959,7 +4629,6 @@
                 <w:bCs/>
               </w:rPr>
             </w:pPr>
-            <w:proofErr w:type="spellStart"/>
             <w:r>
               <w:rPr>
                 <w:rFonts w:ascii="Lato" w:hAnsi="Lato"/>
@@ -4968,7 +4637,6 @@
               </w:rPr>
               <w:t>Rabbitmq</w:t>
             </w:r>
-            <w:proofErr w:type="spellEnd"/>
           </w:p>
         </w:tc>
         <w:tc>
@@ -5019,6 +4687,7 @@
               <w:rPr>
                 <w:rStyle w:val="Strong"/>
                 <w:rFonts w:ascii="Lato" w:hAnsi="Lato"/>
+                <w:color w:val="EE0000"/>
               </w:rPr>
               <w:t>Ordering of messages</w:t>
             </w:r>
@@ -5061,6 +4730,7 @@
             <w:r>
               <w:rPr>
                 <w:rFonts w:ascii="Lato" w:hAnsi="Lato"/>
+                <w:color w:val="EE0000"/>
               </w:rPr>
               <w:t>Partitions in Kafka enable message ordering. Message keys are used while sending the messages to the topic.</w:t>
             </w:r>
@@ -5110,21 +4780,7 @@
               <w:rPr>
                 <w:rFonts w:ascii="Lato" w:hAnsi="Lato"/>
               </w:rPr>
-              <w:t xml:space="preserve">Since </w:t>
-            </w:r>
-            <w:proofErr w:type="spellStart"/>
-            <w:r>
-              <w:rPr>
-                <w:rFonts w:ascii="Lato" w:hAnsi="Lato"/>
-              </w:rPr>
-              <w:t>Rabbitmq</w:t>
-            </w:r>
-            <w:proofErr w:type="spellEnd"/>
-            <w:r>
-              <w:rPr>
-                <w:rFonts w:ascii="Lato" w:hAnsi="Lato"/>
-              </w:rPr>
-              <w:t xml:space="preserve"> is a message queue, messages are done away with once consumed and the acknowledgement is sent.</w:t>
+              <w:t>Since Rabbitmq is a message queue, messages are done away with once consumed and the acknowledgement is sent.</w:t>
             </w:r>
           </w:p>
         </w:tc>
@@ -5139,11 +4795,13 @@
             <w:pPr>
               <w:rPr>
                 <w:rFonts w:ascii="Lato" w:hAnsi="Lato"/>
+                <w:highlight w:val="yellow"/>
               </w:rPr>
             </w:pPr>
             <w:r>
               <w:rPr>
                 <w:rFonts w:ascii="Lato" w:hAnsi="Lato"/>
+                <w:highlight w:val="yellow"/>
               </w:rPr>
               <w:t>Since Kafka is a log, the messages are always present there. We can have a message retention policy for the same.</w:t>
             </w:r>
@@ -5210,37 +4868,12 @@
                 <w:rFonts w:ascii="Lato" w:hAnsi="Lato"/>
               </w:rPr>
             </w:pPr>
-            <w:proofErr w:type="spellStart"/>
             <w:r>
               <w:rPr>
                 <w:rFonts w:ascii="Lato" w:hAnsi="Lato"/>
                 <w:color w:val="FF0000"/>
               </w:rPr>
-              <w:t>Prioritising</w:t>
-            </w:r>
-            <w:proofErr w:type="spellEnd"/>
-            <w:r>
-              <w:rPr>
-                <w:rFonts w:ascii="Lato" w:hAnsi="Lato"/>
-                <w:color w:val="FF0000"/>
-              </w:rPr>
-              <w:t xml:space="preserve"> the messages is not possible </w:t>
-            </w:r>
-            <w:proofErr w:type="gramStart"/>
-            <w:r>
-              <w:rPr>
-                <w:rFonts w:ascii="Lato" w:hAnsi="Lato"/>
-                <w:color w:val="FF0000"/>
-              </w:rPr>
-              <w:t>in  Kafka</w:t>
-            </w:r>
-            <w:proofErr w:type="gramEnd"/>
-            <w:r>
-              <w:rPr>
-                <w:rFonts w:ascii="Lato" w:hAnsi="Lato"/>
-                <w:color w:val="FF0000"/>
-              </w:rPr>
-              <w:t>.</w:t>
+              <w:t>Prioritising the messages is not possible in  Kafka.</w:t>
             </w:r>
           </w:p>
         </w:tc>
@@ -5303,11 +4936,13 @@
             <w:pPr>
               <w:rPr>
                 <w:rFonts w:ascii="Lato" w:hAnsi="Lato"/>
+                <w:highlight w:val="yellow"/>
               </w:rPr>
             </w:pPr>
             <w:r>
               <w:rPr>
                 <w:rFonts w:ascii="Lato" w:hAnsi="Lato"/>
+                <w:highlight w:val="yellow"/>
               </w:rPr>
               <w:t>In Kafka, it is guaranteed that the whole batch of messages in a partition is either sent successfully or failed.</w:t>
             </w:r>
@@ -5332,19 +4967,8 @@
           <w:color w:val="373E3F"/>
           <w:spacing w:val="2"/>
         </w:rPr>
-        <w:t xml:space="preserve">Based on </w:t>
-      </w:r>
-      <w:proofErr w:type="gramStart"/>
-      <w:r>
-        <w:rPr>
-          <w:rStyle w:val="Strong"/>
-          <w:rFonts w:ascii="Lato" w:hAnsi="Lato"/>
-          <w:color w:val="373E3F"/>
-          <w:spacing w:val="2"/>
-        </w:rPr>
-        <w:t>Approach :</w:t>
-      </w:r>
-      <w:proofErr w:type="gramEnd"/>
+        <w:t>Based on Approach :</w:t>
+      </w:r>
     </w:p>
     <w:p>
       <w:pPr>
@@ -5401,7 +5025,6 @@
           <w:spacing w:val="2"/>
         </w:rPr>
       </w:pPr>
-      <w:proofErr w:type="spellStart"/>
       <w:r>
         <w:rPr>
           <w:rStyle w:val="Strong"/>
@@ -5411,7 +5034,6 @@
         </w:rPr>
         <w:t>Rabbitmq</w:t>
       </w:r>
-      <w:proofErr w:type="spellEnd"/>
       <w:r>
         <w:rPr>
           <w:rFonts w:ascii="Lato" w:hAnsi="Lato"/>
@@ -5487,7 +5109,6 @@
           <w:spacing w:val="2"/>
         </w:rPr>
       </w:pPr>
-      <w:proofErr w:type="spellStart"/>
       <w:r>
         <w:rPr>
           <w:rStyle w:val="Strong"/>
@@ -5497,7 +5118,6 @@
         </w:rPr>
         <w:t>Rabbitmq</w:t>
       </w:r>
-      <w:proofErr w:type="spellEnd"/>
       <w:r>
         <w:rPr>
           <w:rFonts w:ascii="Lato" w:hAnsi="Lato"/>
@@ -5522,53 +5142,17 @@
         <w:shd w:val="clear" w:color="auto" w:fill="FFFFFF"/>
         <w:rPr>
           <w:rFonts w:ascii="Lato" w:hAnsi="Lato"/>
-          <w:color w:val="515151"/>
-          <w:spacing w:val="2"/>
-        </w:rPr>
-      </w:pPr>
-      <w:r>
-        <w:rPr>
-          <w:rFonts w:ascii="Lato" w:hAnsi="Lato"/>
-          <w:color w:val="515151"/>
-          <w:spacing w:val="2"/>
-        </w:rPr>
-        <w:t xml:space="preserve">25. What are the parameters that you should look for while </w:t>
-      </w:r>
-      <w:proofErr w:type="spellStart"/>
-      <w:r>
-        <w:rPr>
-          <w:rFonts w:ascii="Lato" w:hAnsi="Lato"/>
-          <w:color w:val="515151"/>
-          <w:spacing w:val="2"/>
-        </w:rPr>
-        <w:t>optimising</w:t>
-      </w:r>
-      <w:proofErr w:type="spellEnd"/>
-      <w:r>
-        <w:rPr>
-          <w:rFonts w:ascii="Lato" w:hAnsi="Lato"/>
-          <w:color w:val="515151"/>
-          <w:spacing w:val="2"/>
-        </w:rPr>
-        <w:t xml:space="preserve"> </w:t>
-      </w:r>
-      <w:proofErr w:type="spellStart"/>
-      <w:r>
-        <w:rPr>
-          <w:rFonts w:ascii="Lato" w:hAnsi="Lato"/>
-          <w:color w:val="515151"/>
-          <w:spacing w:val="2"/>
-        </w:rPr>
-        <w:t>kafka</w:t>
-      </w:r>
-      <w:proofErr w:type="spellEnd"/>
-      <w:r>
-        <w:rPr>
-          <w:rFonts w:ascii="Lato" w:hAnsi="Lato"/>
-          <w:color w:val="515151"/>
-          <w:spacing w:val="2"/>
-        </w:rPr>
-        <w:t xml:space="preserve"> for optimal performance?</w:t>
+          <w:color w:val="EE0000"/>
+          <w:spacing w:val="2"/>
+        </w:rPr>
+      </w:pPr>
+      <w:r>
+        <w:rPr>
+          <w:rFonts w:ascii="Lato" w:hAnsi="Lato"/>
+          <w:color w:val="EE0000"/>
+          <w:spacing w:val="2"/>
+        </w:rPr>
+        <w:t>25. What are the parameters that you should look for while optimising kafka for optimal performance?</w:t>
       </w:r>
     </w:p>
     <w:p>
@@ -6131,23 +5715,7 @@
                 <w:rFonts w:ascii="Lato" w:hAnsi="Lato"/>
                 <w:highlight w:val="green"/>
               </w:rPr>
-              <w:t xml:space="preserve">Redis </w:t>
-            </w:r>
-            <w:proofErr w:type="spellStart"/>
-            <w:r>
-              <w:rPr>
-                <w:rFonts w:ascii="Lato" w:hAnsi="Lato"/>
-                <w:highlight w:val="green"/>
-              </w:rPr>
-              <w:t>can not</w:t>
-            </w:r>
-            <w:proofErr w:type="spellEnd"/>
-            <w:r>
-              <w:rPr>
-                <w:rFonts w:ascii="Lato" w:hAnsi="Lato"/>
-                <w:highlight w:val="green"/>
-              </w:rPr>
-              <w:t xml:space="preserve"> manage vast amounts of data because it's an in-memory database</w:t>
+              <w:t>Redis can not manage vast amounts of data because it's an in-memory database</w:t>
             </w:r>
             <w:r>
               <w:rPr>
@@ -6439,25 +6007,7 @@
           <w:color w:val="515151"/>
           <w:spacing w:val="2"/>
         </w:rPr>
-        <w:t xml:space="preserve">28. Differentiate between Kafka and Java Messaging </w:t>
-      </w:r>
-      <w:proofErr w:type="gramStart"/>
-      <w:r>
-        <w:rPr>
-          <w:rFonts w:ascii="Lato" w:hAnsi="Lato"/>
-          <w:color w:val="515151"/>
-          <w:spacing w:val="2"/>
-        </w:rPr>
-        <w:t>Service(</w:t>
-      </w:r>
-      <w:proofErr w:type="gramEnd"/>
-      <w:r>
-        <w:rPr>
-          <w:rFonts w:ascii="Lato" w:hAnsi="Lato"/>
-          <w:color w:val="515151"/>
-          <w:spacing w:val="2"/>
-        </w:rPr>
-        <w:t>JMS).</w:t>
+        <w:t>28. Differentiate between Kafka and Java Messaging Service(JMS).</w:t>
       </w:r>
     </w:p>
     <w:p>
@@ -6588,25 +6138,7 @@
                 <w:b/>
                 <w:bCs/>
               </w:rPr>
-              <w:t xml:space="preserve">Java Messaging </w:t>
-            </w:r>
-            <w:proofErr w:type="gramStart"/>
-            <w:r>
-              <w:rPr>
-                <w:rFonts w:ascii="Lato" w:hAnsi="Lato"/>
-                <w:b/>
-                <w:bCs/>
-              </w:rPr>
-              <w:t>Service(</w:t>
-            </w:r>
-            <w:proofErr w:type="gramEnd"/>
-            <w:r>
-              <w:rPr>
-                <w:rFonts w:ascii="Lato" w:hAnsi="Lato"/>
-                <w:b/>
-                <w:bCs/>
-              </w:rPr>
-              <w:t>JMS)</w:t>
+              <w:t>Java Messaging Service(JMS)</w:t>
             </w:r>
           </w:p>
         </w:tc>
@@ -6657,6 +6189,7 @@
             <w:r>
               <w:rPr>
                 <w:rFonts w:ascii="Lato" w:hAnsi="Lato"/>
+                <w:color w:val="EE0000"/>
               </w:rPr>
               <w:t>The push model is used to deliver the messages. Consumers receive messages on a regular basis.</w:t>
             </w:r>
@@ -6673,11 +6206,13 @@
             <w:pPr>
               <w:rPr>
                 <w:rFonts w:ascii="Lato" w:hAnsi="Lato"/>
+                <w:highlight w:val="yellow"/>
               </w:rPr>
             </w:pPr>
             <w:r>
               <w:rPr>
                 <w:rFonts w:ascii="Lato" w:hAnsi="Lato"/>
+                <w:highlight w:val="yellow"/>
               </w:rPr>
               <w:t>A pull mechanism is used in the delivery method. When consumers are ready to receive the messages, they pull them.</w:t>
             </w:r>
@@ -6704,6 +6239,7 @@
             <w:r>
               <w:rPr>
                 <w:rFonts w:ascii="Lato" w:hAnsi="Lato"/>
+                <w:highlight w:val="yellow"/>
               </w:rPr>
               <w:t>When the JMS queue receives confirmation from the consumer that the message has been received, it is permanently destroyed.</w:t>
             </w:r>
@@ -6725,6 +6261,7 @@
             <w:r>
               <w:rPr>
                 <w:rFonts w:ascii="Lato" w:hAnsi="Lato"/>
+                <w:color w:val="EE0000"/>
               </w:rPr>
               <w:t>Even after the consumer has viewed the communications, they are maintained for a specified length of time.</w:t>
             </w:r>
@@ -6746,11 +6283,13 @@
             <w:pPr>
               <w:rPr>
                 <w:rFonts w:ascii="Lato" w:hAnsi="Lato"/>
+                <w:color w:val="EE0000"/>
               </w:rPr>
             </w:pPr>
             <w:r>
               <w:rPr>
                 <w:rFonts w:ascii="Lato" w:hAnsi="Lato"/>
+                <w:color w:val="EE0000"/>
               </w:rPr>
               <w:t>JMS is better suited to multi-node clusters in very complicated systems.</w:t>
             </w:r>
@@ -6767,11 +6306,13 @@
             <w:pPr>
               <w:rPr>
                 <w:rFonts w:ascii="Lato" w:hAnsi="Lato"/>
+                <w:color w:val="EE0000"/>
               </w:rPr>
             </w:pPr>
             <w:r>
               <w:rPr>
                 <w:rFonts w:ascii="Lato" w:hAnsi="Lato"/>
+                <w:color w:val="EE0000"/>
               </w:rPr>
               <w:t>Kafka is better suited to handling big amounts of data.</w:t>
             </w:r>
@@ -6843,18 +6384,8 @@
           <w:spacing w:val="2"/>
         </w:rPr>
         <w:lastRenderedPageBreak/>
-        <w:t xml:space="preserve">29. What do you understand about Kafka </w:t>
-      </w:r>
-      <w:proofErr w:type="spellStart"/>
-      <w:r>
-        <w:rPr>
-          <w:rFonts w:ascii="Lato" w:hAnsi="Lato"/>
-          <w:color w:val="FF0000"/>
-          <w:spacing w:val="2"/>
-        </w:rPr>
-        <w:t>MirrorMaker</w:t>
-      </w:r>
-      <w:proofErr w:type="spellEnd"/>
+        <w:t>29. What do you understand about Kafka MirrorMaker</w:t>
+      </w:r>
       <w:r>
         <w:rPr>
           <w:rFonts w:ascii="Lato" w:hAnsi="Lato"/>
@@ -6877,46 +6408,18 @@
       <w:r>
         <w:rPr>
           <w:rFonts w:ascii="Lato" w:hAnsi="Lato"/>
+          <w:color w:val="EE0000"/>
+          <w:spacing w:val="2"/>
+        </w:rPr>
+        <w:t>The MirrorMaker is a standalone utility for copying data from one Apache Kafka cluster to another. The MirrorMaker reads data from original cluster topics and writes it to a destination cluster with the same topic name</w:t>
+      </w:r>
+      <w:r>
+        <w:rPr>
+          <w:rFonts w:ascii="Lato" w:hAnsi="Lato"/>
           <w:color w:val="373E3F"/>
           <w:spacing w:val="2"/>
         </w:rPr>
-        <w:t xml:space="preserve">The </w:t>
-      </w:r>
-      <w:proofErr w:type="spellStart"/>
-      <w:r>
-        <w:rPr>
-          <w:rFonts w:ascii="Lato" w:hAnsi="Lato"/>
-          <w:color w:val="373E3F"/>
-          <w:spacing w:val="2"/>
-        </w:rPr>
-        <w:t>MirrorMaker</w:t>
-      </w:r>
-      <w:proofErr w:type="spellEnd"/>
-      <w:r>
-        <w:rPr>
-          <w:rFonts w:ascii="Lato" w:hAnsi="Lato"/>
-          <w:color w:val="373E3F"/>
-          <w:spacing w:val="2"/>
-        </w:rPr>
-        <w:t xml:space="preserve"> is a standalone utility for copying data from one Apache Kafka cluster to another. The </w:t>
-      </w:r>
-      <w:proofErr w:type="spellStart"/>
-      <w:r>
-        <w:rPr>
-          <w:rFonts w:ascii="Lato" w:hAnsi="Lato"/>
-          <w:color w:val="373E3F"/>
-          <w:spacing w:val="2"/>
-        </w:rPr>
-        <w:t>MirrorMaker</w:t>
-      </w:r>
-      <w:proofErr w:type="spellEnd"/>
-      <w:r>
-        <w:rPr>
-          <w:rFonts w:ascii="Lato" w:hAnsi="Lato"/>
-          <w:color w:val="373E3F"/>
-          <w:spacing w:val="2"/>
-        </w:rPr>
-        <w:t xml:space="preserve"> reads data from original cluster topics and writes it to a destination cluster with the same topic name. The source and destination clusters are separate entities that can have various partition counts and offset values.</w:t>
+        <w:t>. The source and destination clusters are separate entities that can have various partition counts and offset values.</w:t>
       </w:r>
     </w:p>
     <w:p>
@@ -7106,18 +6609,8 @@
           <w:color w:val="373E3F"/>
           <w:spacing w:val="2"/>
         </w:rPr>
-        <w:t xml:space="preserve">The following table illustrates the differences between Kafka and </w:t>
-      </w:r>
-      <w:proofErr w:type="gramStart"/>
-      <w:r>
-        <w:rPr>
-          <w:rFonts w:ascii="Lato" w:hAnsi="Lato"/>
-          <w:color w:val="373E3F"/>
-          <w:spacing w:val="2"/>
-        </w:rPr>
-        <w:t>Flume :</w:t>
-      </w:r>
-      <w:proofErr w:type="gramEnd"/>
+        <w:t>The following table illustrates the differences between Kafka and Flume :</w:t>
+      </w:r>
     </w:p>
     <w:tbl>
       <w:tblPr>
@@ -7308,21 +6801,7 @@
               <w:rPr>
                 <w:rFonts w:ascii="Lato" w:hAnsi="Lato"/>
               </w:rPr>
-              <w:t xml:space="preserve">It is made for absorbing and </w:t>
-            </w:r>
-            <w:proofErr w:type="spellStart"/>
-            <w:r>
-              <w:rPr>
-                <w:rFonts w:ascii="Lato" w:hAnsi="Lato"/>
-              </w:rPr>
-              <w:t>analysing</w:t>
-            </w:r>
-            <w:proofErr w:type="spellEnd"/>
-            <w:r>
-              <w:rPr>
-                <w:rFonts w:ascii="Lato" w:hAnsi="Lato"/>
-              </w:rPr>
-              <w:t xml:space="preserve"> real-time streaming data.</w:t>
+              <w:t>It is made for absorbing and analysing real-time streaming data.</w:t>
             </w:r>
           </w:p>
         </w:tc>
@@ -7343,21 +6822,7 @@
               <w:rPr>
                 <w:rFonts w:ascii="Lato" w:hAnsi="Lato"/>
               </w:rPr>
-              <w:t xml:space="preserve">It collects, aggregates, and moves massive amounts of log data from a variety of sources to a </w:t>
-            </w:r>
-            <w:proofErr w:type="spellStart"/>
-            <w:r>
-              <w:rPr>
-                <w:rFonts w:ascii="Lato" w:hAnsi="Lato"/>
-              </w:rPr>
-              <w:t>centralised</w:t>
-            </w:r>
-            <w:proofErr w:type="spellEnd"/>
-            <w:r>
-              <w:rPr>
-                <w:rFonts w:ascii="Lato" w:hAnsi="Lato"/>
-              </w:rPr>
-              <w:t xml:space="preserve"> data repository in an efficient manner.</w:t>
+              <w:t>It collects, aggregates, and moves massive amounts of log data from a variety of sources to a centralised data repository in an efficient manner.</w:t>
             </w:r>
           </w:p>
         </w:tc>
@@ -7568,25 +7033,7 @@
           <w:spacing w:val="2"/>
         </w:rPr>
         <w:lastRenderedPageBreak/>
-        <w:t xml:space="preserve">31. What do you mean by confluent </w:t>
-      </w:r>
-      <w:proofErr w:type="spellStart"/>
-      <w:r>
-        <w:rPr>
-          <w:rFonts w:ascii="Lato" w:hAnsi="Lato"/>
-          <w:color w:val="515151"/>
-          <w:spacing w:val="2"/>
-        </w:rPr>
-        <w:t>kafka</w:t>
-      </w:r>
-      <w:proofErr w:type="spellEnd"/>
-      <w:r>
-        <w:rPr>
-          <w:rFonts w:ascii="Lato" w:hAnsi="Lato"/>
-          <w:color w:val="515151"/>
-          <w:spacing w:val="2"/>
-        </w:rPr>
-        <w:t>? What are its advantages?</w:t>
+        <w:t>31. What do you mean by confluent kafka? What are its advantages?</w:t>
       </w:r>
     </w:p>
     <w:p>
@@ -7613,7 +7060,24 @@
           <w:color w:val="373E3F"/>
           <w:spacing w:val="2"/>
         </w:rPr>
-        <w:t>. Confluent Kafka is a more comprehensive Apache Kafka distribution. It enhances Kafka's integration capabilities by including tools for optimizing and managing Kafka clusters, as well as ways for ensuring the streams' security. Kafka is easy to construct and operate because of the Confluent Platform. Confluent's software comes in three varieties: </w:t>
+        <w:t xml:space="preserve">. Confluent Kafka is a more comprehensive Apache Kafka distribution. </w:t>
+      </w:r>
+      <w:r>
+        <w:rPr>
+          <w:rFonts w:ascii="Lato" w:hAnsi="Lato"/>
+          <w:color w:val="373E3F"/>
+          <w:spacing w:val="2"/>
+          <w:highlight w:val="yellow"/>
+        </w:rPr>
+        <w:t>It enhances Kafka's integration capabilities by including tools for optimizing and managing Kafka clusters, as well as ways for ensuring the streams' security</w:t>
+      </w:r>
+      <w:r>
+        <w:rPr>
+          <w:rFonts w:ascii="Lato" w:hAnsi="Lato"/>
+          <w:color w:val="373E3F"/>
+          <w:spacing w:val="2"/>
+        </w:rPr>
+        <w:t>. Kafka is easy to construct and operate because of the Confluent Platform. Confluent's software comes in three varieties: </w:t>
       </w:r>
     </w:p>
     <w:p>
@@ -7701,18 +7165,8 @@
           <w:color w:val="373E3F"/>
           <w:spacing w:val="2"/>
         </w:rPr>
-        <w:t xml:space="preserve">Following are the advantages of Confluent </w:t>
-      </w:r>
-      <w:proofErr w:type="gramStart"/>
-      <w:r>
-        <w:rPr>
-          <w:rFonts w:ascii="Lato" w:hAnsi="Lato"/>
-          <w:color w:val="373E3F"/>
-          <w:spacing w:val="2"/>
-        </w:rPr>
-        <w:t>Kafka :</w:t>
-      </w:r>
-      <w:proofErr w:type="gramEnd"/>
+        <w:t>Following are the advantages of Confluent Kafka :</w:t>
+      </w:r>
     </w:p>
     <w:p>
       <w:pPr>
@@ -8015,18 +7469,8 @@
           <w:color w:val="373E3F"/>
           <w:spacing w:val="2"/>
         </w:rPr>
-        <w:t xml:space="preserve">Message Compression has the following </w:t>
-      </w:r>
-      <w:proofErr w:type="gramStart"/>
-      <w:r>
-        <w:rPr>
-          <w:rFonts w:ascii="Lato" w:hAnsi="Lato"/>
-          <w:color w:val="373E3F"/>
-          <w:spacing w:val="2"/>
-        </w:rPr>
-        <w:t>disadvantages :</w:t>
-      </w:r>
-      <w:proofErr w:type="gramEnd"/>
+        <w:t>Message Compression has the following disadvantages :</w:t>
+      </w:r>
     </w:p>
     <w:p>
       <w:pPr>
@@ -8132,18 +7576,8 @@
           <w:color w:val="373E3F"/>
           <w:spacing w:val="2"/>
         </w:rPr>
-        <w:t xml:space="preserve">Following are some of the use cases where Kafka is not </w:t>
-      </w:r>
-      <w:proofErr w:type="gramStart"/>
-      <w:r>
-        <w:rPr>
-          <w:rFonts w:ascii="Lato" w:hAnsi="Lato"/>
-          <w:color w:val="373E3F"/>
-          <w:spacing w:val="2"/>
-        </w:rPr>
-        <w:t>suitable :</w:t>
-      </w:r>
-      <w:proofErr w:type="gramEnd"/>
+        <w:t>Following are some of the use cases where Kafka is not suitable :</w:t>
+      </w:r>
     </w:p>
     <w:p>
       <w:pPr>
@@ -8471,18 +7905,8 @@
           <w:color w:val="373E3F"/>
           <w:spacing w:val="2"/>
         </w:rPr>
-        <w:t xml:space="preserve">Following are the guarantees that Kafka </w:t>
-      </w:r>
-      <w:proofErr w:type="gramStart"/>
-      <w:r>
-        <w:rPr>
-          <w:rFonts w:ascii="Lato" w:hAnsi="Lato"/>
-          <w:color w:val="373E3F"/>
-          <w:spacing w:val="2"/>
-        </w:rPr>
-        <w:t>assures :</w:t>
-      </w:r>
-      <w:proofErr w:type="gramEnd"/>
+        <w:t>Following are the guarantees that Kafka assures :</w:t>
+      </w:r>
     </w:p>
     <w:p>
       <w:pPr>
@@ -8588,38 +8012,8 @@
           <w:color w:val="373E3F"/>
           <w:spacing w:val="2"/>
         </w:rPr>
-        <w:t xml:space="preserve">It's as simple as assigning a unique broker id, listeners, and log directory to the </w:t>
-      </w:r>
-      <w:proofErr w:type="spellStart"/>
-      <w:proofErr w:type="gramStart"/>
-      <w:r>
-        <w:rPr>
-          <w:rFonts w:ascii="Lato" w:hAnsi="Lato"/>
-          <w:color w:val="373E3F"/>
-          <w:spacing w:val="2"/>
-        </w:rPr>
-        <w:t>server.properties</w:t>
-      </w:r>
-      <w:proofErr w:type="spellEnd"/>
-      <w:proofErr w:type="gramEnd"/>
-      <w:r>
-        <w:rPr>
-          <w:rFonts w:ascii="Lato" w:hAnsi="Lato"/>
-          <w:color w:val="373E3F"/>
-          <w:spacing w:val="2"/>
-        </w:rPr>
-        <w:t xml:space="preserve"> file to add new brokers to an existing Kafka cluster. However, these brokers will not be allocated any data partitions from the cluster's existing topics, so they won't be performing much work unless the partitions are moved or new topics are formed. A cluster is referred to as unbalanced if it has any of the following </w:t>
-      </w:r>
-      <w:proofErr w:type="gramStart"/>
-      <w:r>
-        <w:rPr>
-          <w:rFonts w:ascii="Lato" w:hAnsi="Lato"/>
-          <w:color w:val="373E3F"/>
-          <w:spacing w:val="2"/>
-        </w:rPr>
-        <w:t>problems :</w:t>
-      </w:r>
-      <w:proofErr w:type="gramEnd"/>
+        <w:t>It's as simple as assigning a unique broker id, listeners, and log directory to the server.properties file to add new brokers to an existing Kafka cluster. However, these brokers will not be allocated any data partitions from the cluster's existing topics, so they won't be performing much work unless the partitions are moved or new topics are formed. A cluster is referred to as unbalanced if it has any of the following problems :</w:t>
+      </w:r>
     </w:p>
     <w:p>
       <w:pPr>
@@ -9028,25 +8422,7 @@
           <w:color w:val="373E3F"/>
           <w:spacing w:val="2"/>
         </w:rPr>
-        <w:t xml:space="preserve">As a result, the Kafka brokers have a leader imbalance. When a node is a leader for more partitions than the </w:t>
-      </w:r>
-      <w:proofErr w:type="gramStart"/>
-      <w:r>
-        <w:rPr>
-          <w:rFonts w:ascii="Lato" w:hAnsi="Lato"/>
-          <w:color w:val="373E3F"/>
-          <w:spacing w:val="2"/>
-        </w:rPr>
-        <w:t>number</w:t>
-      </w:r>
-      <w:proofErr w:type="gramEnd"/>
-      <w:r>
-        <w:rPr>
-          <w:rFonts w:ascii="Lato" w:hAnsi="Lato"/>
-          <w:color w:val="373E3F"/>
-          <w:spacing w:val="2"/>
-        </w:rPr>
-        <w:t xml:space="preserve"> of partitions/number of brokers, the cluster is in a leader skewed condition.</w:t>
+        <w:t>As a result, the Kafka brokers have a leader imbalance. When a node is a leader for more partitions than the number of partitions/number of brokers, the cluster is in a leader skewed condition.</w:t>
       </w:r>
     </w:p>
     <w:p>
@@ -9108,35 +8484,7 @@
           <w:color w:val="515151"/>
           <w:spacing w:val="2"/>
         </w:rPr>
-        <w:t xml:space="preserve">The </w:t>
-      </w:r>
-      <w:proofErr w:type="spellStart"/>
-      <w:proofErr w:type="gramStart"/>
-      <w:r>
-        <w:rPr>
-          <w:rFonts w:ascii="Lato" w:hAnsi="Lato"/>
-          <w:color w:val="515151"/>
-          <w:spacing w:val="2"/>
-        </w:rPr>
-        <w:t>auto.leader</w:t>
-      </w:r>
-      <w:proofErr w:type="gramEnd"/>
-      <w:r>
-        <w:rPr>
-          <w:rFonts w:ascii="Lato" w:hAnsi="Lato"/>
-          <w:color w:val="515151"/>
-          <w:spacing w:val="2"/>
-        </w:rPr>
-        <w:t>.rebalance.enable</w:t>
-      </w:r>
-      <w:proofErr w:type="spellEnd"/>
-      <w:r>
-        <w:rPr>
-          <w:rFonts w:ascii="Lato" w:hAnsi="Lato"/>
-          <w:color w:val="515151"/>
-          <w:spacing w:val="2"/>
-        </w:rPr>
-        <w:t>=true broker option allows the controller node to transfer leadership to the preferred replica leaders, restoring the even distribution.</w:t>
+        <w:t>The auto.leader.rebalance.enable=true broker option allows the controller node to transfer leadership to the preferred replica leaders, restoring the even distribution.</w:t>
       </w:r>
     </w:p>
     <w:p>
@@ -9199,25 +8547,7 @@
           <w:spacing w:val="2"/>
         </w:rPr>
         <w:lastRenderedPageBreak/>
-        <w:t>Let us consider a Kafka cluster with nine brokers. Let the topic name be "</w:t>
-      </w:r>
-      <w:proofErr w:type="spellStart"/>
-      <w:r>
-        <w:rPr>
-          <w:rFonts w:ascii="Lato" w:hAnsi="Lato"/>
-          <w:color w:val="373E3F"/>
-          <w:spacing w:val="2"/>
-        </w:rPr>
-        <w:t>sample_topic</w:t>
-      </w:r>
-      <w:proofErr w:type="spellEnd"/>
-      <w:r>
-        <w:rPr>
-          <w:rFonts w:ascii="Lato" w:hAnsi="Lato"/>
-          <w:color w:val="373E3F"/>
-          <w:spacing w:val="2"/>
-        </w:rPr>
-        <w:t>." The following is how the brokers are assigned to the topic in our example:</w:t>
+        <w:t>Let us consider a Kafka cluster with nine brokers. Let the topic name be "sample_topic." The following is how the brokers are assigned to the topic in our example:</w:t>
       </w:r>
     </w:p>
     <w:tbl>
@@ -9655,25 +8985,7 @@
                 <w:color w:val="373E3F"/>
                 <w:spacing w:val="2"/>
               </w:rPr>
-              <w:t xml:space="preserve">(0, 1, </w:t>
-            </w:r>
-            <w:proofErr w:type="gramStart"/>
-            <w:r>
-              <w:rPr>
-                <w:rFonts w:ascii="Lato" w:hAnsi="Lato"/>
-                <w:color w:val="373E3F"/>
-                <w:spacing w:val="2"/>
-              </w:rPr>
-              <w:t>2 ,</w:t>
-            </w:r>
-            <w:proofErr w:type="gramEnd"/>
-            <w:r>
-              <w:rPr>
-                <w:rFonts w:ascii="Lato" w:hAnsi="Lato"/>
-                <w:color w:val="373E3F"/>
-                <w:spacing w:val="2"/>
-              </w:rPr>
-              <w:t xml:space="preserve"> 9, 10)</w:t>
+              <w:t>(0, 1, 2 , 9, 10)</w:t>
             </w:r>
           </w:p>
         </w:tc>
@@ -10400,57 +9712,28 @@
           <w:color w:val="373E3F"/>
           <w:spacing w:val="2"/>
         </w:rPr>
-        <w:t>On brokers 3,4 and 5, the topic “</w:t>
-      </w:r>
-      <w:proofErr w:type="spellStart"/>
-      <w:r>
+        <w:t>On brokers 3,4 and 5, the topic “sample_topic” is skewed. This is because if the number of partitions per broker on a given issue is more than the average, the broker is considered to be skewed.</w:t>
+      </w:r>
+    </w:p>
+    <w:p>
+      <w:pPr>
+        <w:pStyle w:val="NormalWeb"/>
+        <w:shd w:val="clear" w:color="auto" w:fill="FFFFFF"/>
         <w:rPr>
           <w:rFonts w:ascii="Lato" w:hAnsi="Lato"/>
           <w:color w:val="373E3F"/>
           <w:spacing w:val="2"/>
         </w:rPr>
-        <w:t>sample_topic</w:t>
-      </w:r>
-      <w:proofErr w:type="spellEnd"/>
-      <w:r>
-        <w:rPr>
+      </w:pPr>
+      <w:r>
+        <w:rPr>
+          <w:rStyle w:val="Strong"/>
           <w:rFonts w:ascii="Lato" w:hAnsi="Lato"/>
           <w:color w:val="373E3F"/>
           <w:spacing w:val="2"/>
         </w:rPr>
-        <w:t>” is skewed. This is because if the number of partitions per broker on a given issue is more than the average, the broker is considered to be skewed.</w:t>
-      </w:r>
-    </w:p>
-    <w:p>
-      <w:pPr>
-        <w:pStyle w:val="NormalWeb"/>
-        <w:shd w:val="clear" w:color="auto" w:fill="FFFFFF"/>
-        <w:rPr>
-          <w:rFonts w:ascii="Lato" w:hAnsi="Lato"/>
-          <w:color w:val="373E3F"/>
-          <w:spacing w:val="2"/>
-        </w:rPr>
-      </w:pPr>
-      <w:r>
-        <w:rPr>
-          <w:rStyle w:val="Strong"/>
-          <w:rFonts w:ascii="Lato" w:hAnsi="Lato"/>
-          <w:color w:val="373E3F"/>
-          <w:spacing w:val="2"/>
-        </w:rPr>
-        <w:t xml:space="preserve">Solving the broker skew </w:t>
-      </w:r>
-      <w:proofErr w:type="gramStart"/>
-      <w:r>
-        <w:rPr>
-          <w:rStyle w:val="Strong"/>
-          <w:rFonts w:ascii="Lato" w:hAnsi="Lato"/>
-          <w:color w:val="373E3F"/>
-          <w:spacing w:val="2"/>
-        </w:rPr>
-        <w:t>problem :</w:t>
-      </w:r>
-      <w:proofErr w:type="gramEnd"/>
+        <w:t>Solving the broker skew problem :</w:t>
+      </w:r>
     </w:p>
     <w:p>
       <w:pPr>
@@ -10799,43 +10082,98 @@
           <w:color w:val="515151"/>
           <w:spacing w:val="2"/>
         </w:rPr>
-        <w:t xml:space="preserve">40. What do you mean by </w:t>
-      </w:r>
-      <w:proofErr w:type="spellStart"/>
-      <w:r>
-        <w:rPr>
-          <w:rFonts w:ascii="Lato" w:hAnsi="Lato"/>
-          <w:color w:val="515151"/>
+        <w:t>40. What do you mean by BufferExhaustedException and OutOfMemoryException in Kafka?</w:t>
+      </w:r>
+    </w:p>
+    <w:p>
+      <w:pPr>
+        <w:pStyle w:val="NormalWeb"/>
+        <w:shd w:val="clear" w:color="auto" w:fill="FFFFFF"/>
+        <w:rPr>
+          <w:rFonts w:ascii="Lato" w:hAnsi="Lato"/>
+          <w:color w:val="373E3F"/>
+          <w:spacing w:val="2"/>
+        </w:rPr>
+      </w:pPr>
+      <w:r>
+        <w:rPr>
+          <w:rFonts w:ascii="Lato" w:hAnsi="Lato"/>
+          <w:color w:val="373E3F"/>
+          <w:spacing w:val="2"/>
+        </w:rPr>
+        <w:t>When the producer can't assign memory to a record because the buffer is full, a </w:t>
+      </w:r>
+      <w:r>
+        <w:rPr>
+          <w:rStyle w:val="Strong"/>
+          <w:rFonts w:ascii="Lato" w:hAnsi="Lato"/>
+          <w:color w:val="373E3F"/>
           <w:spacing w:val="2"/>
         </w:rPr>
         <w:t>BufferExhaustedException</w:t>
       </w:r>
-      <w:proofErr w:type="spellEnd"/>
-      <w:r>
-        <w:rPr>
-          <w:rFonts w:ascii="Lato" w:hAnsi="Lato"/>
-          <w:color w:val="515151"/>
-          <w:spacing w:val="2"/>
-        </w:rPr>
-        <w:t xml:space="preserve"> and </w:t>
-      </w:r>
-      <w:proofErr w:type="spellStart"/>
-      <w:r>
-        <w:rPr>
-          <w:rFonts w:ascii="Lato" w:hAnsi="Lato"/>
-          <w:color w:val="515151"/>
+      <w:r>
+        <w:rPr>
+          <w:rFonts w:ascii="Lato" w:hAnsi="Lato"/>
+          <w:color w:val="373E3F"/>
+          <w:spacing w:val="2"/>
+        </w:rPr>
+        <w:t> is thrown. If the producer is in non-blocking mode, and the rate of production exceeds the rate at which data is transferred from the buffer for long enough, the allocated buffer will be depleted, the exception will be thrown.</w:t>
+      </w:r>
+    </w:p>
+    <w:p>
+      <w:pPr>
+        <w:pStyle w:val="NormalWeb"/>
+        <w:shd w:val="clear" w:color="auto" w:fill="FFFFFF"/>
+        <w:rPr>
+          <w:rFonts w:ascii="Lato" w:hAnsi="Lato"/>
+          <w:color w:val="373E3F"/>
+          <w:spacing w:val="2"/>
+        </w:rPr>
+      </w:pPr>
+      <w:r>
+        <w:rPr>
+          <w:rFonts w:ascii="Lato" w:hAnsi="Lato"/>
+          <w:color w:val="373E3F"/>
+          <w:spacing w:val="2"/>
+        </w:rPr>
+        <w:t>If the consumers are sending huge messages or if there is a spike in the number of messages sent at a rate quicker than the rate of downstream processing, an </w:t>
+      </w:r>
+      <w:r>
+        <w:rPr>
+          <w:rStyle w:val="Strong"/>
+          <w:rFonts w:ascii="Lato" w:hAnsi="Lato"/>
+          <w:color w:val="373E3F"/>
           <w:spacing w:val="2"/>
         </w:rPr>
         <w:t>OutOfMemoryException</w:t>
       </w:r>
-      <w:proofErr w:type="spellEnd"/>
-      <w:r>
-        <w:rPr>
-          <w:rFonts w:ascii="Lato" w:hAnsi="Lato"/>
-          <w:color w:val="515151"/>
-          <w:spacing w:val="2"/>
-        </w:rPr>
-        <w:t xml:space="preserve"> in Kafka?</w:t>
+      <w:r>
+        <w:rPr>
+          <w:rFonts w:ascii="Lato" w:hAnsi="Lato"/>
+          <w:color w:val="373E3F"/>
+          <w:spacing w:val="2"/>
+        </w:rPr>
+        <w:t> may arise. As a result, the message queue fills up, consuming memory space.</w:t>
+      </w:r>
+    </w:p>
+    <w:p>
+      <w:pPr>
+        <w:pStyle w:val="Heading3"/>
+        <w:shd w:val="clear" w:color="auto" w:fill="FFFFFF"/>
+        <w:rPr>
+          <w:rFonts w:ascii="Lato" w:hAnsi="Lato"/>
+          <w:color w:val="515151"/>
+          <w:spacing w:val="2"/>
+        </w:rPr>
+      </w:pPr>
+      <w:r>
+        <w:rPr>
+          <w:rFonts w:ascii="Lato" w:hAnsi="Lato"/>
+          <w:color w:val="515151"/>
+          <w:spacing w:val="2"/>
+        </w:rPr>
+        <w:t>41. How will you change the retention time in Kafka at runtime?</w:t>
       </w:r>
     </w:p>
     <w:p>
@@ -10854,130 +10192,7 @@
           <w:color w:val="373E3F"/>
           <w:spacing w:val="2"/>
         </w:rPr>
-        <w:t>When the producer can't assign memory to a record because the buffer is full, a </w:t>
-      </w:r>
-      <w:proofErr w:type="spellStart"/>
-      <w:r>
-        <w:rPr>
-          <w:rStyle w:val="Strong"/>
-          <w:rFonts w:ascii="Lato" w:hAnsi="Lato"/>
-          <w:color w:val="373E3F"/>
-          <w:spacing w:val="2"/>
-        </w:rPr>
-        <w:t>BufferExhaustedException</w:t>
-      </w:r>
-      <w:proofErr w:type="spellEnd"/>
-      <w:r>
-        <w:rPr>
-          <w:rFonts w:ascii="Lato" w:hAnsi="Lato"/>
-          <w:color w:val="373E3F"/>
-          <w:spacing w:val="2"/>
-        </w:rPr>
-        <w:t> is thrown. If the producer is in non-blocking mode, and the rate of production exceeds the rate at which data is transferred from the buffer for long enough, the allocated buffer will be depleted, the exception will be thrown.</w:t>
-      </w:r>
-    </w:p>
-    <w:p>
-      <w:pPr>
-        <w:pStyle w:val="NormalWeb"/>
-        <w:shd w:val="clear" w:color="auto" w:fill="FFFFFF"/>
-        <w:rPr>
-          <w:rFonts w:ascii="Lato" w:hAnsi="Lato"/>
-          <w:color w:val="373E3F"/>
-          <w:spacing w:val="2"/>
-        </w:rPr>
-      </w:pPr>
-      <w:r>
-        <w:rPr>
-          <w:rFonts w:ascii="Lato" w:hAnsi="Lato"/>
-          <w:color w:val="373E3F"/>
-          <w:spacing w:val="2"/>
-        </w:rPr>
-        <w:t>If the consumers are sending huge messages or if there is a spike in the number of messages sent at a rate quicker than the rate of downstream processing, an </w:t>
-      </w:r>
-      <w:proofErr w:type="spellStart"/>
-      <w:r>
-        <w:rPr>
-          <w:rStyle w:val="Strong"/>
-          <w:rFonts w:ascii="Lato" w:hAnsi="Lato"/>
-          <w:color w:val="373E3F"/>
-          <w:spacing w:val="2"/>
-        </w:rPr>
-        <w:t>OutOfMemoryException</w:t>
-      </w:r>
-      <w:proofErr w:type="spellEnd"/>
-      <w:r>
-        <w:rPr>
-          <w:rFonts w:ascii="Lato" w:hAnsi="Lato"/>
-          <w:color w:val="373E3F"/>
-          <w:spacing w:val="2"/>
-        </w:rPr>
-        <w:t> may arise. As a result, the message queue fills up, consuming memory space.</w:t>
-      </w:r>
-    </w:p>
-    <w:p>
-      <w:pPr>
-        <w:pStyle w:val="Heading3"/>
-        <w:shd w:val="clear" w:color="auto" w:fill="FFFFFF"/>
-        <w:rPr>
-          <w:rFonts w:ascii="Lato" w:hAnsi="Lato"/>
-          <w:color w:val="515151"/>
-          <w:spacing w:val="2"/>
-        </w:rPr>
-      </w:pPr>
-      <w:r>
-        <w:rPr>
-          <w:rFonts w:ascii="Lato" w:hAnsi="Lato"/>
-          <w:color w:val="515151"/>
-          <w:spacing w:val="2"/>
-        </w:rPr>
-        <w:t>41. How will you change the retention time in Kafka at runtime?</w:t>
-      </w:r>
-    </w:p>
-    <w:p>
-      <w:pPr>
-        <w:pStyle w:val="NormalWeb"/>
-        <w:shd w:val="clear" w:color="auto" w:fill="FFFFFF"/>
-        <w:rPr>
-          <w:rFonts w:ascii="Lato" w:hAnsi="Lato"/>
-          <w:color w:val="373E3F"/>
-          <w:spacing w:val="2"/>
-        </w:rPr>
-      </w:pPr>
-      <w:r>
-        <w:rPr>
-          <w:rFonts w:ascii="Lato" w:hAnsi="Lato"/>
-          <w:color w:val="373E3F"/>
-          <w:spacing w:val="2"/>
-        </w:rPr>
-        <w:t xml:space="preserve">A topic's retention time can be configured in Kafka. A topic's default retention time is seven days. While creating a new subject, we can set the retention time. When a topic is generated, the broker's property </w:t>
-      </w:r>
-      <w:proofErr w:type="spellStart"/>
-      <w:proofErr w:type="gramStart"/>
-      <w:r>
-        <w:rPr>
-          <w:rFonts w:ascii="Lato" w:hAnsi="Lato"/>
-          <w:color w:val="373E3F"/>
-          <w:spacing w:val="2"/>
-        </w:rPr>
-        <w:t>log.retention</w:t>
-      </w:r>
-      <w:proofErr w:type="gramEnd"/>
-      <w:r>
-        <w:rPr>
-          <w:rFonts w:ascii="Lato" w:hAnsi="Lato"/>
-          <w:color w:val="373E3F"/>
-          <w:spacing w:val="2"/>
-        </w:rPr>
-        <w:t>.hours</w:t>
-      </w:r>
-      <w:proofErr w:type="spellEnd"/>
-      <w:r>
-        <w:rPr>
-          <w:rFonts w:ascii="Lato" w:hAnsi="Lato"/>
-          <w:color w:val="373E3F"/>
-          <w:spacing w:val="2"/>
-        </w:rPr>
-        <w:t xml:space="preserve"> are used to set the retention </w:t>
+        <w:t xml:space="preserve">A topic's retention time can be configured in Kafka. A topic's default retention time is seven days. While creating a new subject, we can set the retention time. When a topic is generated, the broker's property log.retention.hours are used to set the retention </w:t>
       </w:r>
       <w:r>
         <w:rPr>
@@ -11349,21 +10564,7 @@
               <w:rPr>
                 <w:rFonts w:ascii="Lato" w:hAnsi="Lato"/>
               </w:rPr>
-              <w:t xml:space="preserve">To keep the data durable, you'll need to utilize a </w:t>
-            </w:r>
-            <w:proofErr w:type="spellStart"/>
-            <w:r>
-              <w:rPr>
-                <w:rFonts w:ascii="Lato" w:hAnsi="Lato"/>
-              </w:rPr>
-              <w:t>dataframe</w:t>
-            </w:r>
-            <w:proofErr w:type="spellEnd"/>
-            <w:r>
-              <w:rPr>
-                <w:rFonts w:ascii="Lato" w:hAnsi="Lato"/>
-              </w:rPr>
-              <w:t xml:space="preserve"> or another data structure.</w:t>
+              <w:t>To keep the data durable, you'll need to utilize a dataframe or another data structure.</w:t>
             </w:r>
           </w:p>
         </w:tc>
@@ -11433,43 +10634,7 @@
           <w:spacing w:val="2"/>
         </w:rPr>
         <w:lastRenderedPageBreak/>
-        <w:t xml:space="preserve">43. What are </w:t>
-      </w:r>
-      <w:proofErr w:type="spellStart"/>
-      <w:r>
-        <w:rPr>
-          <w:rFonts w:ascii="Lato" w:hAnsi="Lato"/>
-          <w:color w:val="515151"/>
-          <w:spacing w:val="2"/>
-        </w:rPr>
-        <w:t>Znodes</w:t>
-      </w:r>
-      <w:proofErr w:type="spellEnd"/>
-      <w:r>
-        <w:rPr>
-          <w:rFonts w:ascii="Lato" w:hAnsi="Lato"/>
-          <w:color w:val="515151"/>
-          <w:spacing w:val="2"/>
-        </w:rPr>
-        <w:t xml:space="preserve"> in Kafka Zookeeper? How many types of </w:t>
-      </w:r>
-      <w:proofErr w:type="spellStart"/>
-      <w:r>
-        <w:rPr>
-          <w:rFonts w:ascii="Lato" w:hAnsi="Lato"/>
-          <w:color w:val="515151"/>
-          <w:spacing w:val="2"/>
-        </w:rPr>
-        <w:t>Znodes</w:t>
-      </w:r>
-      <w:proofErr w:type="spellEnd"/>
-      <w:r>
-        <w:rPr>
-          <w:rFonts w:ascii="Lato" w:hAnsi="Lato"/>
-          <w:color w:val="515151"/>
-          <w:spacing w:val="2"/>
-        </w:rPr>
-        <w:t xml:space="preserve"> are there?</w:t>
+        <w:t>43. What are Znodes in Kafka Zookeeper? How many types of Znodes are there?</w:t>
       </w:r>
     </w:p>
     <w:p>
@@ -11488,134 +10653,26 @@
           <w:color w:val="373E3F"/>
           <w:spacing w:val="2"/>
         </w:rPr>
-        <w:t xml:space="preserve">The nodes in a </w:t>
-      </w:r>
-      <w:proofErr w:type="spellStart"/>
-      <w:r>
+        <w:t>The nodes in a ZooKeeper tree are called znodes. Version numbers for data modifications, ACL changes, and timestamps are kept by Znodes in a structure. ZooKeeper uses the version number and timestamp to verify the cache and guarantee that updates are coordinated. Each time the data on Znode changes, the version number connected with it grows.</w:t>
+      </w:r>
+    </w:p>
+    <w:p>
+      <w:pPr>
+        <w:pStyle w:val="NormalWeb"/>
+        <w:shd w:val="clear" w:color="auto" w:fill="FFFFFF"/>
         <w:rPr>
           <w:rFonts w:ascii="Lato" w:hAnsi="Lato"/>
           <w:color w:val="373E3F"/>
           <w:spacing w:val="2"/>
         </w:rPr>
-        <w:t>ZooKeeper</w:t>
-      </w:r>
-      <w:proofErr w:type="spellEnd"/>
+      </w:pPr>
       <w:r>
         <w:rPr>
           <w:rFonts w:ascii="Lato" w:hAnsi="Lato"/>
           <w:color w:val="373E3F"/>
           <w:spacing w:val="2"/>
         </w:rPr>
-        <w:t xml:space="preserve"> tree are called </w:t>
-      </w:r>
-      <w:proofErr w:type="spellStart"/>
-      <w:r>
-        <w:rPr>
-          <w:rFonts w:ascii="Lato" w:hAnsi="Lato"/>
-          <w:color w:val="373E3F"/>
-          <w:spacing w:val="2"/>
-        </w:rPr>
-        <w:t>znodes</w:t>
-      </w:r>
-      <w:proofErr w:type="spellEnd"/>
-      <w:r>
-        <w:rPr>
-          <w:rFonts w:ascii="Lato" w:hAnsi="Lato"/>
-          <w:color w:val="373E3F"/>
-          <w:spacing w:val="2"/>
-        </w:rPr>
-        <w:t xml:space="preserve">. Version numbers for data modifications, ACL changes, and timestamps are kept by </w:t>
-      </w:r>
-      <w:proofErr w:type="spellStart"/>
-      <w:r>
-        <w:rPr>
-          <w:rFonts w:ascii="Lato" w:hAnsi="Lato"/>
-          <w:color w:val="373E3F"/>
-          <w:spacing w:val="2"/>
-        </w:rPr>
-        <w:t>Znodes</w:t>
-      </w:r>
-      <w:proofErr w:type="spellEnd"/>
-      <w:r>
-        <w:rPr>
-          <w:rFonts w:ascii="Lato" w:hAnsi="Lato"/>
-          <w:color w:val="373E3F"/>
-          <w:spacing w:val="2"/>
-        </w:rPr>
-        <w:t xml:space="preserve"> in a structure. </w:t>
-      </w:r>
-      <w:proofErr w:type="spellStart"/>
-      <w:r>
-        <w:rPr>
-          <w:rFonts w:ascii="Lato" w:hAnsi="Lato"/>
-          <w:color w:val="373E3F"/>
-          <w:spacing w:val="2"/>
-        </w:rPr>
-        <w:t>ZooKeeper</w:t>
-      </w:r>
-      <w:proofErr w:type="spellEnd"/>
-      <w:r>
-        <w:rPr>
-          <w:rFonts w:ascii="Lato" w:hAnsi="Lato"/>
-          <w:color w:val="373E3F"/>
-          <w:spacing w:val="2"/>
-        </w:rPr>
-        <w:t xml:space="preserve"> uses the version number and timestamp to verify the cache and guarantee that updates are coordinated. Each time the data on </w:t>
-      </w:r>
-      <w:proofErr w:type="spellStart"/>
-      <w:r>
-        <w:rPr>
-          <w:rFonts w:ascii="Lato" w:hAnsi="Lato"/>
-          <w:color w:val="373E3F"/>
-          <w:spacing w:val="2"/>
-        </w:rPr>
-        <w:t>Znode</w:t>
-      </w:r>
-      <w:proofErr w:type="spellEnd"/>
-      <w:r>
-        <w:rPr>
-          <w:rFonts w:ascii="Lato" w:hAnsi="Lato"/>
-          <w:color w:val="373E3F"/>
-          <w:spacing w:val="2"/>
-        </w:rPr>
-        <w:t xml:space="preserve"> changes, the version number connected with it grows.</w:t>
-      </w:r>
-    </w:p>
-    <w:p>
-      <w:pPr>
-        <w:pStyle w:val="NormalWeb"/>
-        <w:shd w:val="clear" w:color="auto" w:fill="FFFFFF"/>
-        <w:rPr>
-          <w:rFonts w:ascii="Lato" w:hAnsi="Lato"/>
-          <w:color w:val="373E3F"/>
-          <w:spacing w:val="2"/>
-        </w:rPr>
-      </w:pPr>
-      <w:r>
-        <w:rPr>
-          <w:rFonts w:ascii="Lato" w:hAnsi="Lato"/>
-          <w:color w:val="373E3F"/>
-          <w:spacing w:val="2"/>
-        </w:rPr>
-        <w:t xml:space="preserve">There are three different types of </w:t>
-      </w:r>
-      <w:proofErr w:type="spellStart"/>
-      <w:r>
-        <w:rPr>
-          <w:rFonts w:ascii="Lato" w:hAnsi="Lato"/>
-          <w:color w:val="373E3F"/>
-          <w:spacing w:val="2"/>
-        </w:rPr>
-        <w:t>Znodes</w:t>
-      </w:r>
-      <w:proofErr w:type="spellEnd"/>
-      <w:r>
-        <w:rPr>
-          <w:rFonts w:ascii="Lato" w:hAnsi="Lato"/>
-          <w:color w:val="373E3F"/>
-          <w:spacing w:val="2"/>
-        </w:rPr>
-        <w:t>:</w:t>
+        <w:t>There are three different types of Znodes:</w:t>
       </w:r>
     </w:p>
     <w:p>
@@ -11705,71 +10762,15 @@
           <w:color w:val="515151"/>
           <w:spacing w:val="2"/>
         </w:rPr>
-        <w:t xml:space="preserve">Persistence </w:t>
-      </w:r>
-      <w:proofErr w:type="spellStart"/>
-      <w:r>
-        <w:rPr>
-          <w:rStyle w:val="Strong"/>
-          <w:rFonts w:ascii="Lato" w:hAnsi="Lato"/>
-          <w:color w:val="515151"/>
-          <w:spacing w:val="2"/>
-        </w:rPr>
-        <w:t>Znode</w:t>
-      </w:r>
-      <w:proofErr w:type="spellEnd"/>
-      <w:r>
-        <w:rPr>
-          <w:rStyle w:val="Strong"/>
-          <w:rFonts w:ascii="Lato" w:hAnsi="Lato"/>
-          <w:color w:val="515151"/>
-          <w:spacing w:val="2"/>
-        </w:rPr>
-        <w:t>:</w:t>
-      </w:r>
-      <w:r>
-        <w:rPr>
-          <w:rFonts w:ascii="Lato" w:hAnsi="Lato"/>
-          <w:color w:val="515151"/>
-          <w:spacing w:val="2"/>
-        </w:rPr>
-        <w:t xml:space="preserve"> These are </w:t>
-      </w:r>
-      <w:proofErr w:type="spellStart"/>
-      <w:r>
-        <w:rPr>
-          <w:rFonts w:ascii="Lato" w:hAnsi="Lato"/>
-          <w:color w:val="515151"/>
-          <w:spacing w:val="2"/>
-        </w:rPr>
-        <w:t>znodes</w:t>
-      </w:r>
-      <w:proofErr w:type="spellEnd"/>
-      <w:r>
-        <w:rPr>
-          <w:rFonts w:ascii="Lato" w:hAnsi="Lato"/>
-          <w:color w:val="515151"/>
-          <w:spacing w:val="2"/>
-        </w:rPr>
-        <w:t xml:space="preserve"> that continue to function even after the client who created them has been disconnected. Unless otherwise specified, all </w:t>
-      </w:r>
-      <w:proofErr w:type="spellStart"/>
-      <w:r>
-        <w:rPr>
-          <w:rFonts w:ascii="Lato" w:hAnsi="Lato"/>
-          <w:color w:val="515151"/>
-          <w:spacing w:val="2"/>
-        </w:rPr>
-        <w:t>znodes</w:t>
-      </w:r>
-      <w:proofErr w:type="spellEnd"/>
-      <w:r>
-        <w:rPr>
-          <w:rFonts w:ascii="Lato" w:hAnsi="Lato"/>
-          <w:color w:val="515151"/>
-          <w:spacing w:val="2"/>
-        </w:rPr>
-        <w:t xml:space="preserve"> are persistent by default.</w:t>
+        <w:t>Persistence Znode:</w:t>
+      </w:r>
+      <w:r>
+        <w:rPr>
+          <w:rFonts w:ascii="Lato" w:hAnsi="Lato"/>
+          <w:color w:val="515151"/>
+          <w:spacing w:val="2"/>
+        </w:rPr>
+        <w:t> These are znodes that continue to function even after the client who created them has been disconnected. Unless otherwise specified, all znodes are persistent by default.</w:t>
       </w:r>
     </w:p>
     <w:p>
@@ -11793,89 +10794,15 @@
           <w:color w:val="515151"/>
           <w:spacing w:val="2"/>
         </w:rPr>
-        <w:t xml:space="preserve">Ephemeral </w:t>
-      </w:r>
-      <w:proofErr w:type="spellStart"/>
-      <w:r>
-        <w:rPr>
-          <w:rStyle w:val="Strong"/>
-          <w:rFonts w:ascii="Lato" w:hAnsi="Lato"/>
-          <w:color w:val="515151"/>
-          <w:spacing w:val="2"/>
-        </w:rPr>
-        <w:t>Znode</w:t>
-      </w:r>
-      <w:proofErr w:type="spellEnd"/>
-      <w:r>
-        <w:rPr>
-          <w:rStyle w:val="Strong"/>
-          <w:rFonts w:ascii="Lato" w:hAnsi="Lato"/>
-          <w:color w:val="515151"/>
-          <w:spacing w:val="2"/>
-        </w:rPr>
-        <w:t>:</w:t>
-      </w:r>
-      <w:r>
-        <w:rPr>
-          <w:rFonts w:ascii="Lato" w:hAnsi="Lato"/>
-          <w:color w:val="515151"/>
-          <w:spacing w:val="2"/>
-        </w:rPr>
-        <w:t xml:space="preserve"> Ephemeral </w:t>
-      </w:r>
-      <w:proofErr w:type="spellStart"/>
-      <w:r>
-        <w:rPr>
-          <w:rFonts w:ascii="Lato" w:hAnsi="Lato"/>
-          <w:color w:val="515151"/>
-          <w:spacing w:val="2"/>
-        </w:rPr>
-        <w:t>znodes</w:t>
-      </w:r>
-      <w:proofErr w:type="spellEnd"/>
-      <w:r>
-        <w:rPr>
-          <w:rFonts w:ascii="Lato" w:hAnsi="Lato"/>
-          <w:color w:val="515151"/>
-          <w:spacing w:val="2"/>
-        </w:rPr>
-        <w:t xml:space="preserve"> are only active while the client is still alive. When the client who produced them disconnects from the </w:t>
-      </w:r>
-      <w:proofErr w:type="spellStart"/>
-      <w:r>
-        <w:rPr>
-          <w:rFonts w:ascii="Lato" w:hAnsi="Lato"/>
-          <w:color w:val="515151"/>
-          <w:spacing w:val="2"/>
-        </w:rPr>
-        <w:t>ZooKeeper</w:t>
-      </w:r>
-      <w:proofErr w:type="spellEnd"/>
-      <w:r>
-        <w:rPr>
-          <w:rFonts w:ascii="Lato" w:hAnsi="Lato"/>
-          <w:color w:val="515151"/>
-          <w:spacing w:val="2"/>
-        </w:rPr>
-        <w:t xml:space="preserve"> ensemble, the ephemeral </w:t>
-      </w:r>
-      <w:proofErr w:type="spellStart"/>
-      <w:r>
-        <w:rPr>
-          <w:rFonts w:ascii="Lato" w:hAnsi="Lato"/>
-          <w:color w:val="515151"/>
-          <w:spacing w:val="2"/>
-        </w:rPr>
-        <w:t>Znodes</w:t>
-      </w:r>
-      <w:proofErr w:type="spellEnd"/>
-      <w:r>
-        <w:rPr>
-          <w:rFonts w:ascii="Lato" w:hAnsi="Lato"/>
-          <w:color w:val="515151"/>
-          <w:spacing w:val="2"/>
-        </w:rPr>
-        <w:t xml:space="preserve"> are automatically removed. They have a significant part in the election of the leader.</w:t>
+        <w:t>Ephemeral Znode:</w:t>
+      </w:r>
+      <w:r>
+        <w:rPr>
+          <w:rFonts w:ascii="Lato" w:hAnsi="Lato"/>
+          <w:color w:val="515151"/>
+          <w:spacing w:val="2"/>
+        </w:rPr>
+        <w:t> Ephemeral znodes are only active while the client is still alive. When the client who produced them disconnects from the ZooKeeper ensemble, the ephemeral Znodes are automatically removed. They have a significant part in the election of the leader.</w:t>
       </w:r>
     </w:p>
     <w:p>
@@ -11899,89 +10826,15 @@
           <w:color w:val="515151"/>
           <w:spacing w:val="2"/>
         </w:rPr>
-        <w:t xml:space="preserve">Sequential </w:t>
-      </w:r>
-      <w:proofErr w:type="spellStart"/>
-      <w:r>
-        <w:rPr>
-          <w:rStyle w:val="Strong"/>
-          <w:rFonts w:ascii="Lato" w:hAnsi="Lato"/>
-          <w:color w:val="515151"/>
-          <w:spacing w:val="2"/>
-        </w:rPr>
-        <w:t>Znode</w:t>
-      </w:r>
-      <w:proofErr w:type="spellEnd"/>
-      <w:r>
-        <w:rPr>
-          <w:rStyle w:val="Strong"/>
-          <w:rFonts w:ascii="Lato" w:hAnsi="Lato"/>
-          <w:color w:val="515151"/>
-          <w:spacing w:val="2"/>
-        </w:rPr>
-        <w:t>:</w:t>
-      </w:r>
-      <w:r>
-        <w:rPr>
-          <w:rFonts w:ascii="Lato" w:hAnsi="Lato"/>
-          <w:color w:val="515151"/>
-          <w:spacing w:val="2"/>
-        </w:rPr>
-        <w:t xml:space="preserve"> When </w:t>
-      </w:r>
-      <w:proofErr w:type="spellStart"/>
-      <w:r>
-        <w:rPr>
-          <w:rFonts w:ascii="Lato" w:hAnsi="Lato"/>
-          <w:color w:val="515151"/>
-          <w:spacing w:val="2"/>
-        </w:rPr>
-        <w:t>znodes</w:t>
-      </w:r>
-      <w:proofErr w:type="spellEnd"/>
-      <w:r>
-        <w:rPr>
-          <w:rFonts w:ascii="Lato" w:hAnsi="Lato"/>
-          <w:color w:val="515151"/>
-          <w:spacing w:val="2"/>
-        </w:rPr>
-        <w:t xml:space="preserve"> are constructed, the </w:t>
-      </w:r>
-      <w:proofErr w:type="spellStart"/>
-      <w:r>
-        <w:rPr>
-          <w:rFonts w:ascii="Lato" w:hAnsi="Lato"/>
-          <w:color w:val="515151"/>
-          <w:spacing w:val="2"/>
-        </w:rPr>
-        <w:t>ZooKeeper</w:t>
-      </w:r>
-      <w:proofErr w:type="spellEnd"/>
-      <w:r>
-        <w:rPr>
-          <w:rFonts w:ascii="Lato" w:hAnsi="Lato"/>
-          <w:color w:val="515151"/>
-          <w:spacing w:val="2"/>
-        </w:rPr>
-        <w:t xml:space="preserve"> can be asked to append an increasing counter to the path's end. The parent </w:t>
-      </w:r>
-      <w:proofErr w:type="spellStart"/>
-      <w:r>
-        <w:rPr>
-          <w:rFonts w:ascii="Lato" w:hAnsi="Lato"/>
-          <w:color w:val="515151"/>
-          <w:spacing w:val="2"/>
-        </w:rPr>
-        <w:t>znode's</w:t>
-      </w:r>
-      <w:proofErr w:type="spellEnd"/>
-      <w:r>
-        <w:rPr>
-          <w:rFonts w:ascii="Lato" w:hAnsi="Lato"/>
-          <w:color w:val="515151"/>
-          <w:spacing w:val="2"/>
-        </w:rPr>
-        <w:t xml:space="preserve"> counter is unique. Sequential nodes can be either persistent or ephemeral.</w:t>
+        <w:t>Sequential Znode:</w:t>
+      </w:r>
+      <w:r>
+        <w:rPr>
+          <w:rFonts w:ascii="Lato" w:hAnsi="Lato"/>
+          <w:color w:val="515151"/>
+          <w:spacing w:val="2"/>
+        </w:rPr>
+        <w:t> When znodes are constructed, the ZooKeeper can be asked to append an increasing counter to the path's end. The parent znode's counter is unique. Sequential nodes can be either persistent or ephemeral.</w:t>
       </w:r>
     </w:p>
     <w:p>
@@ -12692,7 +11545,6 @@
           <w:lang w:val="en"/>
         </w:rPr>
       </w:pPr>
-      <w:proofErr w:type="spellStart"/>
       <w:r>
         <w:rPr>
           <w:rStyle w:val="vjs-control-text"/>
@@ -12706,7 +11558,6 @@
         <w:lastRenderedPageBreak/>
         <w:t>PlayNext</w:t>
       </w:r>
-      <w:proofErr w:type="spellEnd"/>
     </w:p>
     <w:p>
       <w:pPr>
@@ -12756,9 +11607,57 @@
           <w:bdr w:val="none" w:sz="0" w:space="0" w:color="auto" w:frame="1"/>
           <w:lang w:val="en"/>
         </w:rPr>
-        <w:t xml:space="preserve">Current </w:t>
-      </w:r>
-      <w:proofErr w:type="spellStart"/>
+        <w:t>Current TimeÂ </w:t>
+      </w:r>
+      <w:r>
+        <w:rPr>
+          <w:rStyle w:val="vjs-current-time-display"/>
+          <w:rFonts w:ascii="Roboto" w:hAnsi="Roboto"/>
+          <w:color w:val="FFFFFF"/>
+          <w:sz w:val="18"/>
+          <w:szCs w:val="18"/>
+          <w:lang w:val="en"/>
+        </w:rPr>
+        <w:t>0:00</w:t>
+      </w:r>
+    </w:p>
+    <w:p>
+      <w:pPr>
+        <w:spacing w:line="720" w:lineRule="atLeast"/>
+        <w:jc w:val="center"/>
+        <w:textAlignment w:val="top"/>
+        <w:rPr>
+          <w:rFonts w:ascii="Roboto" w:hAnsi="Roboto"/>
+          <w:color w:val="FFFFFF"/>
+          <w:sz w:val="18"/>
+          <w:szCs w:val="18"/>
+          <w:lang w:val="en"/>
+        </w:rPr>
+      </w:pPr>
+      <w:r>
+        <w:rPr>
+          <w:rFonts w:ascii="Roboto" w:hAnsi="Roboto"/>
+          <w:color w:val="FFFFFF"/>
+          <w:sz w:val="18"/>
+          <w:szCs w:val="18"/>
+          <w:lang w:val="en"/>
+        </w:rPr>
+        <w:t>/</w:t>
+      </w:r>
+    </w:p>
+    <w:p>
+      <w:pPr>
+        <w:spacing w:line="720" w:lineRule="atLeast"/>
+        <w:jc w:val="center"/>
+        <w:textAlignment w:val="top"/>
+        <w:rPr>
+          <w:rFonts w:ascii="Roboto" w:hAnsi="Roboto"/>
+          <w:color w:val="FFFFFF"/>
+          <w:sz w:val="18"/>
+          <w:szCs w:val="18"/>
+          <w:lang w:val="en"/>
+        </w:rPr>
+      </w:pPr>
       <w:r>
         <w:rPr>
           <w:rStyle w:val="vjs-control-text"/>
@@ -12769,95 +11668,7 @@
           <w:bdr w:val="none" w:sz="0" w:space="0" w:color="auto" w:frame="1"/>
           <w:lang w:val="en"/>
         </w:rPr>
-        <w:t>TimeÂ</w:t>
-      </w:r>
-      <w:proofErr w:type="spellEnd"/>
-      <w:r>
-        <w:rPr>
-          <w:rStyle w:val="vjs-control-text"/>
-          <w:rFonts w:ascii="Roboto" w:hAnsi="Roboto"/>
-          <w:color w:val="FFFFFF"/>
-          <w:sz w:val="18"/>
-          <w:szCs w:val="18"/>
-          <w:bdr w:val="none" w:sz="0" w:space="0" w:color="auto" w:frame="1"/>
-          <w:lang w:val="en"/>
-        </w:rPr>
-        <w:t> </w:t>
-      </w:r>
-      <w:r>
-        <w:rPr>
-          <w:rStyle w:val="vjs-current-time-display"/>
-          <w:rFonts w:ascii="Roboto" w:hAnsi="Roboto"/>
-          <w:color w:val="FFFFFF"/>
-          <w:sz w:val="18"/>
-          <w:szCs w:val="18"/>
-          <w:lang w:val="en"/>
-        </w:rPr>
-        <w:t>0:00</w:t>
-      </w:r>
-    </w:p>
-    <w:p>
-      <w:pPr>
-        <w:spacing w:line="720" w:lineRule="atLeast"/>
-        <w:jc w:val="center"/>
-        <w:textAlignment w:val="top"/>
-        <w:rPr>
-          <w:rFonts w:ascii="Roboto" w:hAnsi="Roboto"/>
-          <w:color w:val="FFFFFF"/>
-          <w:sz w:val="18"/>
-          <w:szCs w:val="18"/>
-          <w:lang w:val="en"/>
-        </w:rPr>
-      </w:pPr>
-      <w:r>
-        <w:rPr>
-          <w:rFonts w:ascii="Roboto" w:hAnsi="Roboto"/>
-          <w:color w:val="FFFFFF"/>
-          <w:sz w:val="18"/>
-          <w:szCs w:val="18"/>
-          <w:lang w:val="en"/>
-        </w:rPr>
-        <w:t>/</w:t>
-      </w:r>
-    </w:p>
-    <w:p>
-      <w:pPr>
-        <w:spacing w:line="720" w:lineRule="atLeast"/>
-        <w:jc w:val="center"/>
-        <w:textAlignment w:val="top"/>
-        <w:rPr>
-          <w:rFonts w:ascii="Roboto" w:hAnsi="Roboto"/>
-          <w:color w:val="FFFFFF"/>
-          <w:sz w:val="18"/>
-          <w:szCs w:val="18"/>
-          <w:lang w:val="en"/>
-        </w:rPr>
-      </w:pPr>
-      <w:proofErr w:type="spellStart"/>
-      <w:r>
-        <w:rPr>
-          <w:rStyle w:val="vjs-control-text"/>
-          <w:rFonts w:ascii="Roboto" w:hAnsi="Roboto"/>
-          <w:color w:val="FFFFFF"/>
-          <w:sz w:val="18"/>
-          <w:szCs w:val="18"/>
-          <w:bdr w:val="none" w:sz="0" w:space="0" w:color="auto" w:frame="1"/>
-          <w:lang w:val="en"/>
-        </w:rPr>
-        <w:t>DurationÂ</w:t>
-      </w:r>
-      <w:proofErr w:type="spellEnd"/>
-      <w:r>
-        <w:rPr>
-          <w:rStyle w:val="vjs-control-text"/>
-          <w:rFonts w:ascii="Roboto" w:hAnsi="Roboto"/>
-          <w:color w:val="FFFFFF"/>
-          <w:sz w:val="18"/>
-          <w:szCs w:val="18"/>
-          <w:bdr w:val="none" w:sz="0" w:space="0" w:color="auto" w:frame="1"/>
-          <w:lang w:val="en"/>
-        </w:rPr>
-        <w:t> </w:t>
+        <w:t>DurationÂ </w:t>
       </w:r>
       <w:r>
         <w:rPr>
@@ -12979,33 +11790,7 @@
           <w:bdr w:val="none" w:sz="0" w:space="0" w:color="auto" w:frame="1"/>
           <w:lang w:val="en"/>
         </w:rPr>
-        <w:t xml:space="preserve">Backward Skip 10sPlay </w:t>
-      </w:r>
-      <w:proofErr w:type="spellStart"/>
-      <w:r>
-        <w:rPr>
-          <w:rStyle w:val="vjs-control-text"/>
-          <w:rFonts w:ascii="Roboto" w:hAnsi="Roboto"/>
-          <w:color w:val="FFFFFF"/>
-          <w:sz w:val="21"/>
-          <w:szCs w:val="21"/>
-          <w:bdr w:val="none" w:sz="0" w:space="0" w:color="auto" w:frame="1"/>
-          <w:lang w:val="en"/>
-        </w:rPr>
-        <w:t>VideoForward</w:t>
-      </w:r>
-      <w:proofErr w:type="spellEnd"/>
-      <w:r>
-        <w:rPr>
-          <w:rStyle w:val="vjs-control-text"/>
-          <w:rFonts w:ascii="Roboto" w:hAnsi="Roboto"/>
-          <w:color w:val="FFFFFF"/>
-          <w:sz w:val="21"/>
-          <w:szCs w:val="21"/>
-          <w:bdr w:val="none" w:sz="0" w:space="0" w:color="auto" w:frame="1"/>
-          <w:lang w:val="en"/>
-        </w:rPr>
-        <w:t xml:space="preserve"> Skip 10s</w:t>
+        <w:t>Backward Skip 10sPlay VideoForward Skip 10s</w:t>
       </w:r>
     </w:p>
     <w:p>
@@ -13045,9 +11830,52 @@
           <w:sz w:val="32"/>
           <w:szCs w:val="32"/>
         </w:rPr>
-        <w:t xml:space="preserve">5) What is the role of the </w:t>
-      </w:r>
-      <w:proofErr w:type="spellStart"/>
+        <w:t>5) What is the role of the ZooKeeper in Kafka?</w:t>
+      </w:r>
+    </w:p>
+    <w:p>
+      <w:pPr>
+        <w:pStyle w:val="NormalWeb"/>
+        <w:shd w:val="clear" w:color="auto" w:fill="FFFFFF"/>
+        <w:jc w:val="both"/>
+        <w:rPr>
+          <w:rFonts w:ascii="Segoe UI" w:hAnsi="Segoe UI" w:cs="Segoe UI"/>
+          <w:color w:val="333333"/>
+        </w:rPr>
+      </w:pPr>
+      <w:r>
+        <w:rPr>
+          <w:rFonts w:ascii="Segoe UI" w:hAnsi="Segoe UI" w:cs="Segoe UI"/>
+          <w:color w:val="333333"/>
+        </w:rPr>
+        <w:t>Apache Kafka is a distributed system. Within the Kafka environment, the ZooKeeper stores offset-related information, which is used to consume a specific topic and by a specific consumer group. The main role of Zookeeper is to build coordination between different nodes in a cluster, but it can also be used to recover from previously committed offset if any node fails as it works as periodically commit offset.</w:t>
+      </w:r>
+    </w:p>
+    <w:p>
+      <w:pPr>
+        <w:rPr>
+          <w:rFonts w:ascii="Times New Roman" w:hAnsi="Times New Roman" w:cs="Times New Roman"/>
+        </w:rPr>
+      </w:pPr>
+      <w:r>
+        <w:pict w14:anchorId="05CCD58A">
+          <v:rect id="_x0000_i1030" style="width:0;height:.75pt" o:hrstd="t" o:hrnoshade="t" o:hr="t" fillcolor="#d4d4d4" stroked="f"/>
+        </w:pict>
+      </w:r>
+    </w:p>
+    <w:p>
+      <w:pPr>
+        <w:pStyle w:val="Heading3"/>
+        <w:shd w:val="clear" w:color="auto" w:fill="FFFFFF"/>
+        <w:spacing w:line="312" w:lineRule="atLeast"/>
+        <w:jc w:val="both"/>
+        <w:rPr>
+          <w:rFonts w:ascii="Helvetica" w:hAnsi="Helvetica"/>
+          <w:color w:val="610B4B"/>
+          <w:sz w:val="32"/>
+          <w:szCs w:val="32"/>
+        </w:rPr>
+      </w:pPr>
       <w:r>
         <w:rPr>
           <w:rFonts w:ascii="Helvetica" w:hAnsi="Helvetica"/>
@@ -13057,19 +11885,7 @@
           <w:sz w:val="32"/>
           <w:szCs w:val="32"/>
         </w:rPr>
-        <w:t>ZooKeeper</w:t>
-      </w:r>
-      <w:proofErr w:type="spellEnd"/>
-      <w:r>
-        <w:rPr>
-          <w:rFonts w:ascii="Helvetica" w:hAnsi="Helvetica"/>
-          <w:b/>
-          <w:bCs/>
-          <w:color w:val="610B4B"/>
-          <w:sz w:val="32"/>
-          <w:szCs w:val="32"/>
-        </w:rPr>
-        <w:t xml:space="preserve"> in Kafka?</w:t>
+        <w:t>6) Can we use Apache Kafka without ZooKeeper? / Is it possible to use Kafka without ZooKeeper?</w:t>
       </w:r>
     </w:p>
     <w:p>
@@ -13087,158 +11903,7 @@
           <w:rFonts w:ascii="Segoe UI" w:hAnsi="Segoe UI" w:cs="Segoe UI"/>
           <w:color w:val="333333"/>
         </w:rPr>
-        <w:t xml:space="preserve">Apache Kafka is a distributed system. Within the Kafka environment, the </w:t>
-      </w:r>
-      <w:proofErr w:type="spellStart"/>
-      <w:r>
-        <w:rPr>
-          <w:rFonts w:ascii="Segoe UI" w:hAnsi="Segoe UI" w:cs="Segoe UI"/>
-          <w:color w:val="333333"/>
-        </w:rPr>
-        <w:t>ZooKeeper</w:t>
-      </w:r>
-      <w:proofErr w:type="spellEnd"/>
-      <w:r>
-        <w:rPr>
-          <w:rFonts w:ascii="Segoe UI" w:hAnsi="Segoe UI" w:cs="Segoe UI"/>
-          <w:color w:val="333333"/>
-        </w:rPr>
-        <w:t xml:space="preserve"> stores offset-related information, which is used to consume a specific topic and by a specific consumer group. The main role of Zookeeper is to build coordination between different nodes in a cluster, but it can also be used to recover from previously committed offset if any node fails as it works as periodically commit offset.</w:t>
-      </w:r>
-    </w:p>
-    <w:p>
-      <w:pPr>
-        <w:rPr>
-          <w:rFonts w:ascii="Times New Roman" w:hAnsi="Times New Roman" w:cs="Times New Roman"/>
-        </w:rPr>
-      </w:pPr>
-      <w:r>
-        <w:pict w14:anchorId="05CCD58A">
-          <v:rect id="_x0000_i1030" style="width:0;height:.75pt" o:hrstd="t" o:hrnoshade="t" o:hr="t" fillcolor="#d4d4d4" stroked="f"/>
-        </w:pict>
-      </w:r>
-    </w:p>
-    <w:p>
-      <w:pPr>
-        <w:pStyle w:val="Heading3"/>
-        <w:shd w:val="clear" w:color="auto" w:fill="FFFFFF"/>
-        <w:spacing w:line="312" w:lineRule="atLeast"/>
-        <w:jc w:val="both"/>
-        <w:rPr>
-          <w:rFonts w:ascii="Helvetica" w:hAnsi="Helvetica"/>
-          <w:color w:val="610B4B"/>
-          <w:sz w:val="32"/>
-          <w:szCs w:val="32"/>
-        </w:rPr>
-      </w:pPr>
-      <w:r>
-        <w:rPr>
-          <w:rFonts w:ascii="Helvetica" w:hAnsi="Helvetica"/>
-          <w:b/>
-          <w:bCs/>
-          <w:color w:val="610B4B"/>
-          <w:sz w:val="32"/>
-          <w:szCs w:val="32"/>
-        </w:rPr>
-        <w:t xml:space="preserve">6) Can we use Apache Kafka without </w:t>
-      </w:r>
-      <w:proofErr w:type="spellStart"/>
-      <w:r>
-        <w:rPr>
-          <w:rFonts w:ascii="Helvetica" w:hAnsi="Helvetica"/>
-          <w:b/>
-          <w:bCs/>
-          <w:color w:val="610B4B"/>
-          <w:sz w:val="32"/>
-          <w:szCs w:val="32"/>
-        </w:rPr>
-        <w:t>ZooKeeper</w:t>
-      </w:r>
-      <w:proofErr w:type="spellEnd"/>
-      <w:r>
-        <w:rPr>
-          <w:rFonts w:ascii="Helvetica" w:hAnsi="Helvetica"/>
-          <w:b/>
-          <w:bCs/>
-          <w:color w:val="610B4B"/>
-          <w:sz w:val="32"/>
-          <w:szCs w:val="32"/>
-        </w:rPr>
-        <w:t xml:space="preserve">? / Is it possible to use Kafka without </w:t>
-      </w:r>
-      <w:proofErr w:type="spellStart"/>
-      <w:r>
-        <w:rPr>
-          <w:rFonts w:ascii="Helvetica" w:hAnsi="Helvetica"/>
-          <w:b/>
-          <w:bCs/>
-          <w:color w:val="610B4B"/>
-          <w:sz w:val="32"/>
-          <w:szCs w:val="32"/>
-        </w:rPr>
-        <w:t>ZooKeeper</w:t>
-      </w:r>
-      <w:proofErr w:type="spellEnd"/>
-      <w:r>
-        <w:rPr>
-          <w:rFonts w:ascii="Helvetica" w:hAnsi="Helvetica"/>
-          <w:b/>
-          <w:bCs/>
-          <w:color w:val="610B4B"/>
-          <w:sz w:val="32"/>
-          <w:szCs w:val="32"/>
-        </w:rPr>
-        <w:t>?</w:t>
-      </w:r>
-    </w:p>
-    <w:p>
-      <w:pPr>
-        <w:pStyle w:val="NormalWeb"/>
-        <w:shd w:val="clear" w:color="auto" w:fill="FFFFFF"/>
-        <w:jc w:val="both"/>
-        <w:rPr>
-          <w:rFonts w:ascii="Segoe UI" w:hAnsi="Segoe UI" w:cs="Segoe UI"/>
-          <w:color w:val="333333"/>
-        </w:rPr>
-      </w:pPr>
-      <w:r>
-        <w:rPr>
-          <w:rFonts w:ascii="Segoe UI" w:hAnsi="Segoe UI" w:cs="Segoe UI"/>
-          <w:color w:val="333333"/>
-        </w:rPr>
-        <w:t xml:space="preserve">It is impossible to sideline Zookeeper and connect directly to the Kafka server. So, we cannot use Apache Kafka without </w:t>
-      </w:r>
-      <w:proofErr w:type="spellStart"/>
-      <w:r>
-        <w:rPr>
-          <w:rFonts w:ascii="Segoe UI" w:hAnsi="Segoe UI" w:cs="Segoe UI"/>
-          <w:color w:val="333333"/>
-        </w:rPr>
-        <w:t>ZooKeeper</w:t>
-      </w:r>
-      <w:proofErr w:type="spellEnd"/>
-      <w:r>
-        <w:rPr>
-          <w:rFonts w:ascii="Segoe UI" w:hAnsi="Segoe UI" w:cs="Segoe UI"/>
-          <w:color w:val="333333"/>
-        </w:rPr>
-        <w:t xml:space="preserve">. If </w:t>
-      </w:r>
-      <w:proofErr w:type="spellStart"/>
-      <w:r>
-        <w:rPr>
-          <w:rFonts w:ascii="Segoe UI" w:hAnsi="Segoe UI" w:cs="Segoe UI"/>
-          <w:color w:val="333333"/>
-        </w:rPr>
-        <w:t>ZooKeeper</w:t>
-      </w:r>
-      <w:proofErr w:type="spellEnd"/>
-      <w:r>
-        <w:rPr>
-          <w:rFonts w:ascii="Segoe UI" w:hAnsi="Segoe UI" w:cs="Segoe UI"/>
-          <w:color w:val="333333"/>
-        </w:rPr>
-        <w:t xml:space="preserve"> is down, we cannot serve any client request in Kafka.</w:t>
+        <w:t>It is impossible to sideline Zookeeper and connect directly to the Kafka server. So, we cannot use Apache Kafka without ZooKeeper. If ZooKeeper is down, we cannot serve any client request in Kafka.</w:t>
       </w:r>
     </w:p>
     <w:p>
@@ -14189,23 +12854,7 @@
           <w:rFonts w:ascii="Segoe UI" w:hAnsi="Segoe UI" w:cs="Segoe UI"/>
           <w:color w:val="000000"/>
         </w:rPr>
-        <w:t xml:space="preserve">One server </w:t>
-      </w:r>
-      <w:proofErr w:type="gramStart"/>
-      <w:r>
-        <w:rPr>
-          <w:rFonts w:ascii="Segoe UI" w:hAnsi="Segoe UI" w:cs="Segoe UI"/>
-          <w:color w:val="000000"/>
-        </w:rPr>
-        <w:t>acts</w:t>
-      </w:r>
-      <w:proofErr w:type="gramEnd"/>
-      <w:r>
-        <w:rPr>
-          <w:rFonts w:ascii="Segoe UI" w:hAnsi="Segoe UI" w:cs="Segoe UI"/>
-          <w:color w:val="000000"/>
-        </w:rPr>
-        <w:t xml:space="preserve"> as the leader of each partition or replica, while the others act as followers.</w:t>
+        <w:t>One server acts as the leader of each partition or replica, while the others act as followers.</w:t>
       </w:r>
     </w:p>
     <w:p>
@@ -14791,23 +13440,7 @@
           <w:rFonts w:ascii="Segoe UI" w:hAnsi="Segoe UI" w:cs="Segoe UI"/>
           <w:color w:val="000000"/>
         </w:rPr>
-        <w:t xml:space="preserve">Start the </w:t>
-      </w:r>
-      <w:proofErr w:type="spellStart"/>
-      <w:r>
-        <w:rPr>
-          <w:rFonts w:ascii="Segoe UI" w:hAnsi="Segoe UI" w:cs="Segoe UI"/>
-          <w:color w:val="000000"/>
-        </w:rPr>
-        <w:t>ZooKeeper</w:t>
-      </w:r>
-      <w:proofErr w:type="spellEnd"/>
-      <w:r>
-        <w:rPr>
-          <w:rFonts w:ascii="Segoe UI" w:hAnsi="Segoe UI" w:cs="Segoe UI"/>
-          <w:color w:val="000000"/>
-        </w:rPr>
-        <w:t xml:space="preserve"> service by doing the following:</w:t>
+        <w:t>Start the ZooKeeper service by doing the following:</w:t>
       </w:r>
     </w:p>
     <w:p>
@@ -14830,25 +13463,7 @@
           <w:color w:val="000000"/>
           <w:bdr w:val="none" w:sz="0" w:space="0" w:color="auto" w:frame="1"/>
         </w:rPr>
-        <w:t>$bin/zookeeper-server-start.sh config/</w:t>
-      </w:r>
-      <w:proofErr w:type="spellStart"/>
-      <w:r>
-        <w:rPr>
-          <w:rFonts w:ascii="Segoe UI" w:hAnsi="Segoe UI" w:cs="Segoe UI"/>
-          <w:color w:val="000000"/>
-          <w:bdr w:val="none" w:sz="0" w:space="0" w:color="auto" w:frame="1"/>
-        </w:rPr>
-        <w:t>zookeeper.properties</w:t>
-      </w:r>
-      <w:proofErr w:type="spellEnd"/>
-      <w:r>
-        <w:rPr>
-          <w:rFonts w:ascii="Segoe UI" w:hAnsi="Segoe UI" w:cs="Segoe UI"/>
-          <w:color w:val="000000"/>
-          <w:bdr w:val="none" w:sz="0" w:space="0" w:color="auto" w:frame="1"/>
-        </w:rPr>
-        <w:t>  </w:t>
+        <w:t>$bin/zookeeper-server-start.sh config/zookeeper.properties  </w:t>
       </w:r>
     </w:p>
     <w:p>
@@ -14893,25 +13508,7 @@
           <w:color w:val="000000"/>
           <w:bdr w:val="none" w:sz="0" w:space="0" w:color="auto" w:frame="1"/>
         </w:rPr>
-        <w:t>$ bin/kafka-server-start.sh config/</w:t>
-      </w:r>
-      <w:proofErr w:type="spellStart"/>
-      <w:r>
-        <w:rPr>
-          <w:rFonts w:ascii="Segoe UI" w:hAnsi="Segoe UI" w:cs="Segoe UI"/>
-          <w:color w:val="000000"/>
-          <w:bdr w:val="none" w:sz="0" w:space="0" w:color="auto" w:frame="1"/>
-        </w:rPr>
-        <w:t>server.properties</w:t>
-      </w:r>
-      <w:proofErr w:type="spellEnd"/>
-      <w:r>
-        <w:rPr>
-          <w:rFonts w:ascii="Segoe UI" w:hAnsi="Segoe UI" w:cs="Segoe UI"/>
-          <w:color w:val="000000"/>
-          <w:bdr w:val="none" w:sz="0" w:space="0" w:color="auto" w:frame="1"/>
-        </w:rPr>
-        <w:t>  </w:t>
+        <w:t>$ bin/kafka-server-start.sh config/server.properties  </w:t>
       </w:r>
     </w:p>
     <w:p>
@@ -15100,41 +13697,7 @@
           <w:rFonts w:ascii="Segoe UI" w:hAnsi="Segoe UI" w:cs="Segoe UI"/>
           <w:color w:val="333333"/>
         </w:rPr>
-        <w:t xml:space="preserve">The Kafka procedure API does the producer functionality through one API call to the client. Especially, the Kafka producer API combines the efforts of </w:t>
-      </w:r>
-      <w:proofErr w:type="spellStart"/>
-      <w:proofErr w:type="gramStart"/>
-      <w:r>
-        <w:rPr>
-          <w:rFonts w:ascii="Segoe UI" w:hAnsi="Segoe UI" w:cs="Segoe UI"/>
-          <w:color w:val="333333"/>
-        </w:rPr>
-        <w:t>Kafka.producer.SyncProducer</w:t>
-      </w:r>
-      <w:proofErr w:type="spellEnd"/>
-      <w:proofErr w:type="gramEnd"/>
-      <w:r>
-        <w:rPr>
-          <w:rFonts w:ascii="Segoe UI" w:hAnsi="Segoe UI" w:cs="Segoe UI"/>
-          <w:color w:val="333333"/>
-        </w:rPr>
-        <w:t xml:space="preserve"> and the </w:t>
-      </w:r>
-      <w:proofErr w:type="spellStart"/>
-      <w:r>
-        <w:rPr>
-          <w:rFonts w:ascii="Segoe UI" w:hAnsi="Segoe UI" w:cs="Segoe UI"/>
-          <w:color w:val="333333"/>
-        </w:rPr>
-        <w:t>Kafka.producer.async.Async</w:t>
-      </w:r>
-      <w:proofErr w:type="spellEnd"/>
-      <w:r>
-        <w:rPr>
-          <w:rFonts w:ascii="Segoe UI" w:hAnsi="Segoe UI" w:cs="Segoe UI"/>
-          <w:color w:val="333333"/>
-        </w:rPr>
-        <w:t xml:space="preserve"> Producer.</w:t>
+        <w:t>The Kafka procedure API does the producer functionality through one API call to the client. Especially, the Kafka producer API combines the efforts of Kafka.producer.SyncProducer and the Kafka.producer.async.Async Producer.</w:t>
       </w:r>
     </w:p>
     <w:p>
@@ -15925,23 +14488,7 @@
           <w:rFonts w:ascii="Segoe UI" w:hAnsi="Segoe UI" w:cs="Segoe UI"/>
           <w:color w:val="333333"/>
         </w:rPr>
-        <w:t xml:space="preserve">In Kafka, geo-replication is a feature that facilitates you to copy messages form one cluster to many other data centers or cloud regions. Using geo-replication, you can replicate all of the files and store them throughout the globe if required. We can accomplish geo-replication by using Kafka's </w:t>
-      </w:r>
-      <w:proofErr w:type="spellStart"/>
-      <w:r>
-        <w:rPr>
-          <w:rFonts w:ascii="Segoe UI" w:hAnsi="Segoe UI" w:cs="Segoe UI"/>
-          <w:color w:val="333333"/>
-        </w:rPr>
-        <w:t>MirrorMaker</w:t>
-      </w:r>
-      <w:proofErr w:type="spellEnd"/>
-      <w:r>
-        <w:rPr>
-          <w:rFonts w:ascii="Segoe UI" w:hAnsi="Segoe UI" w:cs="Segoe UI"/>
-          <w:color w:val="333333"/>
-        </w:rPr>
-        <w:t xml:space="preserve"> Tool. By using the geo-replication technique, we can ensure data backup without any failure.</w:t>
+        <w:t>In Kafka, geo-replication is a feature that facilitates you to copy messages form one cluster to many other data centers or cloud regions. Using geo-replication, you can replicate all of the files and store them throughout the globe if required. We can accomplish geo-replication by using Kafka's MirrorMaker Tool. By using the geo-replication technique, we can ensure data backup without any failure.</w:t>
       </w:r>
     </w:p>
     <w:p>
@@ -16964,23 +15511,7 @@
           <w:rFonts w:ascii="Segoe UI" w:hAnsi="Segoe UI" w:cs="Segoe UI"/>
           <w:color w:val="000000"/>
         </w:rPr>
-        <w:t xml:space="preserve"> Apache Kafka has a great throughput value, so; it can manage a huge </w:t>
-      </w:r>
-      <w:proofErr w:type="gramStart"/>
-      <w:r>
-        <w:rPr>
-          <w:rFonts w:ascii="Segoe UI" w:hAnsi="Segoe UI" w:cs="Segoe UI"/>
-          <w:color w:val="000000"/>
-        </w:rPr>
-        <w:t>amount</w:t>
-      </w:r>
-      <w:proofErr w:type="gramEnd"/>
-      <w:r>
-        <w:rPr>
-          <w:rFonts w:ascii="Segoe UI" w:hAnsi="Segoe UI" w:cs="Segoe UI"/>
-          <w:color w:val="000000"/>
-        </w:rPr>
-        <w:t xml:space="preserve"> of comparable types of messages or data. Apache Kafka can be used as a publish-subscribe messaging system that allows data to be read and published conveniently.</w:t>
+        <w:t> Apache Kafka has a great throughput value, so; it can manage a huge amount of comparable types of messages or data. Apache Kafka can be used as a publish-subscribe messaging system that allows data to be read and published conveniently.</w:t>
       </w:r>
     </w:p>
     <w:p>

</xml_diff>